<commit_message>
release(p11): accepted buyer edition and price
</commit_message>
<xml_diff>
--- a/products-storage/13-raschet-metrami/50-slovar-poley-raschet-metrami.docx
+++ b/products-storage/13-raschet-metrami/50-slovar-poley-raschet-metrami.docx
@@ -5,30 +5,35 @@
     <w:p>
       <w:pPr>
         <w:pStyle w:val="Heading1"/>
-        <w:spacing w:after="200" w:before="240"/>
+        <w:pBdr>
+          <w:top w:val="single" w:sz="12" w:space="5" w:color="B08D57"/>
+        </w:pBdr>
+        <w:spacing w:after="60" w:before="0"/>
       </w:pPr>
       <w:r>
         <w:rPr>
           <w:rFonts w:ascii="Times New Roman" w:cs="Times New Roman" w:eastAsia="Times New Roman" w:hAnsi="Times New Roman"/>
           <w:b/>
           <w:bCs/>
+          <w:i w:val="0"/>
+          <w:color w:val="323539"/>
           <w:sz w:val="32"/>
           <w:szCs w:val="32"/>
         </w:rPr>
-        <w:t xml:space="preserve">Словарь полей комплекта «Расчёт метрами: проверка до подписи»</w:t>
+        <w:t>Словарь полей комплекта «Расчёты в неденежной форме: жилые и офисные помещения, машино-места»</w:t>
       </w:r>
     </w:p>
     <w:p>
       <w:pPr>
-        <w:spacing w:after="120" w:line="276"/>
+        <w:spacing w:after="60" w:line="259" w:before="0" w:lineRule="auto"/>
       </w:pPr>
       <w:r>
         <w:rPr>
           <w:rFonts w:ascii="Times New Roman" w:cs="Times New Roman" w:eastAsia="Times New Roman" w:hAnsi="Times New Roman"/>
-          <w:i/>
-          <w:iCs/>
-          <w:color w:val="595959"/>
-          <w:sz w:val="24"/>
+          <w:i w:val="0"/>
+          <w:iCs w:val="0"/>
+          <w:color w:val="323539"/>
+          <w:sz w:val="21"/>
           <w:szCs w:val="24"/>
         </w:rPr>
         <w:t xml:space="preserve">Ключ к заполнению документов комплекта: каждое поле в двойных фигурных скобках — что в него вписать и откуда взять значение.</w:t>
@@ -63,14 +68,18 @@
           </w:tcPr>
           <w:p>
             <w:pPr>
-              <w:spacing w:after="100" w:line="276"/>
-            </w:pPr>
-            <w:r>
-              <w:rPr>
-                <w:rFonts w:ascii="Times New Roman" w:cs="Times New Roman" w:eastAsia="Times New Roman" w:hAnsi="Times New Roman"/>
-                <w:b/>
-                <w:bCs/>
-                <w:sz w:val="24"/>
+              <w:keepNext w:val="0"/>
+              <w:keepLines w:val="0"/>
+              <w:spacing w:after="20" w:line="259" w:before="0" w:lineRule="auto"/>
+            </w:pPr>
+            <w:r>
+              <w:rPr>
+                <w:rFonts w:ascii="Times New Roman" w:cs="Times New Roman" w:eastAsia="Times New Roman" w:hAnsi="Times New Roman"/>
+                <w:b/>
+                <w:bCs/>
+                <w:i w:val="0"/>
+                <w:color w:val="323539"/>
+                <w:sz w:val="16"/>
                 <w:szCs w:val="24"/>
               </w:rPr>
               <w:t xml:space="preserve">Важно, прочитайте до использования</w:t>
@@ -78,54 +87,70 @@
           </w:p>
           <w:p>
             <w:pPr>
-              <w:spacing w:after="100" w:line="276"/>
-            </w:pPr>
-            <w:r>
-              <w:rPr>
-                <w:rFonts w:ascii="Times New Roman" w:cs="Times New Roman" w:eastAsia="Times New Roman" w:hAnsi="Times New Roman"/>
-                <w:sz w:val="24"/>
+              <w:keepNext w:val="0"/>
+              <w:keepLines w:val="0"/>
+              <w:spacing w:after="20" w:line="259" w:before="0" w:lineRule="auto"/>
+            </w:pPr>
+            <w:r>
+              <w:rPr>
+                <w:rFonts w:ascii="Times New Roman" w:cs="Times New Roman" w:eastAsia="Times New Roman" w:hAnsi="Times New Roman"/>
+                <w:i w:val="0"/>
+                <w:color w:val="323539"/>
+                <w:sz w:val="16"/>
                 <w:szCs w:val="24"/>
               </w:rPr>
-              <w:t xml:space="preserve">Это порядок проверки предложения «рассчитаемся квартирами» и типовые запросы к сторонам сделки, а не юридическая консультация и не гарантия того, что сделка окажется безопасной или что ответы на запросы будут получены. Комплект делает видимым, что именно вам предлагают — оплаченную квартиру или долг за неё, — и переводит решение из «по старой памяти» в решение по проверенным фактам.</w:t>
-            </w:r>
-          </w:p>
-          <w:p>
-            <w:pPr>
-              <w:spacing w:after="100" w:line="276"/>
-            </w:pPr>
-            <w:r>
-              <w:rPr>
-                <w:rFonts w:ascii="Times New Roman" w:cs="Times New Roman" w:eastAsia="Times New Roman" w:hAnsi="Times New Roman"/>
-                <w:sz w:val="24"/>
+              <w:t>Комплект предназначен для проверки расчётов жилыми и офисными помещениями, машино-местами либо правами на них. По единому алгоритму оцениваются форма передачи, зарегистрированные права, обременения и стоимость объекта. При уступке прав по ДДУ дополнительно проверяется наполнение соответствующего счёта эскроу.</w:t>
+            </w:r>
+          </w:p>
+          <w:p>
+            <w:pPr>
+              <w:keepNext w:val="0"/>
+              <w:keepLines w:val="0"/>
+              <w:spacing w:after="20" w:line="259" w:before="0" w:lineRule="auto"/>
+            </w:pPr>
+            <w:r>
+              <w:rPr>
+                <w:rFonts w:ascii="Times New Roman" w:cs="Times New Roman" w:eastAsia="Times New Roman" w:hAnsi="Times New Roman"/>
+                <w:i w:val="0"/>
+                <w:color w:val="323539"/>
+                <w:sz w:val="16"/>
                 <w:szCs w:val="24"/>
               </w:rPr>
-              <w:t xml:space="preserve">Тексты вычитку юристом не проходили. Нормативные ссылки сверены с действующими редакциями отдельным заходом 09.08.2026; сверка подтверждает, что нормы названы верно, и не заменяет оценку вашей сделки по конкретным документам.</w:t>
-            </w:r>
-          </w:p>
-          <w:p>
-            <w:pPr>
-              <w:spacing w:after="100" w:line="276"/>
-            </w:pPr>
-            <w:r>
-              <w:rPr>
-                <w:rFonts w:ascii="Times New Roman" w:cs="Times New Roman" w:eastAsia="Times New Roman" w:hAnsi="Times New Roman"/>
-                <w:sz w:val="24"/>
+              <w:t>До подписания проверьте документы о праве на объект и обременениях. При уступке прав по ДДУ дополнительно сопоставьте ДДУ, уступку и банковские подтверждения с применимыми положениями Закона № 214-ФЗ; при переводе долга — с п. 2 ст. 391 ГК РФ.</w:t>
+            </w:r>
+          </w:p>
+          <w:p>
+            <w:pPr>
+              <w:keepNext w:val="0"/>
+              <w:keepLines w:val="0"/>
+              <w:spacing w:after="20" w:line="259" w:before="0" w:lineRule="auto"/>
+            </w:pPr>
+            <w:r>
+              <w:rPr>
+                <w:rFonts w:ascii="Times New Roman" w:cs="Times New Roman" w:eastAsia="Times New Roman" w:hAnsi="Times New Roman"/>
+                <w:i w:val="0"/>
+                <w:color w:val="323539"/>
+                <w:sz w:val="16"/>
                 <w:szCs w:val="24"/>
               </w:rPr>
-              <w:t xml:space="preserve">Граница проходит по стадии. Пока сделка обсуждается и бумаги не подписаны — комплект работает. Уступка уже подписана и идёт спор — дальше работа юриста по конкретным документам. Застройщик в процедуре банкротства — это комплект «Реестр требований кредиторов» и юрист, а не эти файлы.</w:t>
-            </w:r>
-          </w:p>
-          <w:p>
-            <w:pPr>
-              <w:spacing w:after="0" w:line="276"/>
-            </w:pPr>
-            <w:r>
-              <w:rPr>
-                <w:rFonts w:ascii="Times New Roman" w:cs="Times New Roman" w:eastAsia="Times New Roman" w:hAnsi="Times New Roman"/>
-                <w:sz w:val="24"/>
+              <w:t>Граница проходит по стадии. Проверка проводится на стадии согласования сделки до подписания договора и документов о передаче. При возникших разногласиях после подписания документы передаются для правовой оценки. При банкротстве застройщика отдельно проверяется порядок предъявления требований в соответствующей процедуре.</w:t>
+            </w:r>
+          </w:p>
+          <w:p>
+            <w:pPr>
+              <w:keepNext w:val="0"/>
+              <w:keepLines w:val="0"/>
+              <w:spacing w:after="20" w:line="259" w:before="0" w:lineRule="auto"/>
+            </w:pPr>
+            <w:r>
+              <w:rPr>
+                <w:rFonts w:ascii="Times New Roman" w:cs="Times New Roman" w:eastAsia="Times New Roman" w:hAnsi="Times New Roman"/>
+                <w:i w:val="0"/>
+                <w:color w:val="323539"/>
+                <w:sz w:val="16"/>
                 <w:szCs w:val="24"/>
               </w:rPr>
-              <w:t xml:space="preserve">Числовых норм закона в файлах нет намеренно: нормы названы по имени, значения берутся из действующей редакции на дату проверки — скачанный файл не обновляется сам. Сделку с уступкой при пустом или не пополненном счёте эскроу без юриста не подписывать.</w:t>
+              <w:t>При неполном пополнении эскроу отдельно проверьте, кто обязан внести недостающую сумму, условия одновременного перевода долга и согласие кредитора. Подтверждение расчётов между сторонами не означает поступления средств на счёт эскроу.</w:t>
             </w:r>
           </w:p>
         </w:tc>
@@ -133,20 +158,22 @@
     </w:tbl>
     <w:p>
       <w:pPr>
-        <w:spacing w:after="120" w:line="276"/>
+        <w:spacing w:after="60" w:line="259" w:before="0" w:lineRule="auto"/>
       </w:pPr>
     </w:p>
     <w:p>
       <w:pPr>
         <w:pStyle w:val="Heading2"/>
         <w:keepNext/>
-        <w:spacing w:after="120" w:before="260"/>
+        <w:spacing w:after="60" w:before="0"/>
       </w:pPr>
       <w:r>
         <w:rPr>
           <w:rFonts w:ascii="Times New Roman" w:cs="Times New Roman" w:eastAsia="Times New Roman" w:hAnsi="Times New Roman"/>
           <w:b/>
           <w:bCs/>
+          <w:i w:val="0"/>
+          <w:color w:val="323539"/>
           <w:sz w:val="26"/>
           <w:szCs w:val="26"/>
         </w:rPr>
@@ -160,15 +187,17 @@
           <w:ilvl w:val="0"/>
           <w:numId w:val="2"/>
         </w:numPr>
-        <w:spacing w:after="80" w:line="276"/>
+        <w:spacing w:after="60" w:line="259" w:before="0" w:lineRule="auto"/>
       </w:pPr>
       <w:r>
         <w:rPr>
           <w:rFonts w:ascii="Times New Roman" w:cs="Times New Roman" w:eastAsia="Times New Roman" w:hAnsi="Times New Roman"/>
-          <w:sz w:val="24"/>
+          <w:i w:val="0"/>
+          <w:color w:val="323539"/>
+          <w:sz w:val="21"/>
           <w:szCs w:val="24"/>
         </w:rPr>
-        <w:t xml:space="preserve">Заполняйте поля по этой таблице, затем поиском по документу убедитесь, что скобок «{{» не осталось: незаполненное поле в отправленном письме хуже задержки на день.</w:t>
+        <w:t>Заполняйте поля по этой таблице, затем поиском по документу убедитесь, что скобок «{{» не осталось: письмо с незаполненными реквизитами не должно направляться адресату.</w:t>
       </w:r>
     </w:p>
     <w:p>
@@ -178,12 +207,14 @@
           <w:ilvl w:val="0"/>
           <w:numId w:val="2"/>
         </w:numPr>
-        <w:spacing w:after="80" w:line="276"/>
+        <w:spacing w:after="60" w:line="259" w:before="0" w:lineRule="auto"/>
       </w:pPr>
       <w:r>
         <w:rPr>
           <w:rFonts w:ascii="Times New Roman" w:cs="Times New Roman" w:eastAsia="Times New Roman" w:hAnsi="Times New Roman"/>
-          <w:sz w:val="24"/>
+          <w:i w:val="0"/>
+          <w:color w:val="323539"/>
+          <w:sz w:val="21"/>
           <w:szCs w:val="24"/>
         </w:rPr>
         <w:t xml:space="preserve">Поля с вариантами через косую черту (например, основание запроса) заполняются выбором одного варианта; невыбранный удаляется целиком.</w:t>
@@ -196,12 +227,14 @@
           <w:ilvl w:val="0"/>
           <w:numId w:val="2"/>
         </w:numPr>
-        <w:spacing w:after="80" w:line="276"/>
+        <w:spacing w:after="60" w:line="259" w:before="0" w:lineRule="auto"/>
       </w:pPr>
       <w:r>
         <w:rPr>
           <w:rFonts w:ascii="Times New Roman" w:cs="Times New Roman" w:eastAsia="Times New Roman" w:hAnsi="Times New Roman"/>
-          <w:sz w:val="24"/>
+          <w:i w:val="0"/>
+          <w:color w:val="323539"/>
+          <w:sz w:val="21"/>
           <w:szCs w:val="24"/>
         </w:rPr>
         <w:t xml:space="preserve">Блок «Стороны» общий с остальными комплектами: значения, подставленные в документы других комплектов, переносятся сюда без изменений.</w:t>
@@ -211,13 +244,15 @@
       <w:pPr>
         <w:pStyle w:val="Heading2"/>
         <w:keepNext/>
-        <w:spacing w:after="120" w:before="260"/>
+        <w:spacing w:after="60" w:before="0"/>
       </w:pPr>
       <w:r>
         <w:rPr>
           <w:rFonts w:ascii="Times New Roman" w:cs="Times New Roman" w:eastAsia="Times New Roman" w:hAnsi="Times New Roman"/>
           <w:b/>
           <w:bCs/>
+          <w:i w:val="0"/>
+          <w:color w:val="323539"/>
           <w:sz w:val="26"/>
           <w:szCs w:val="26"/>
         </w:rPr>
@@ -235,11 +270,12 @@
           <w:insideH w:val="single" w:color="auto" w:sz="4"/>
           <w:insideV w:val="single" w:color="auto" w:sz="4"/>
         </w:tblBorders>
+        <w:tblLayout w:type="fixed"/>
       </w:tblPr>
       <w:tblGrid>
-        <w:gridCol w:w="3200"/>
-        <w:gridCol w:w="3300"/>
-        <w:gridCol w:w="2860"/>
+        <w:gridCol w:w="3798"/>
+        <w:gridCol w:w="3458"/>
+        <w:gridCol w:w="2551"/>
       </w:tblGrid>
       <w:tr>
         <w:trPr>
@@ -258,14 +294,18 @@
           </w:tcPr>
           <w:p>
             <w:pPr>
-              <w:spacing w:after="0" w:line="240"/>
-            </w:pPr>
-            <w:r>
-              <w:rPr>
-                <w:rFonts w:ascii="Times New Roman" w:cs="Times New Roman" w:eastAsia="Times New Roman" w:hAnsi="Times New Roman"/>
-                <w:b/>
-                <w:bCs/>
-                <w:sz w:val="22"/>
+              <w:keepNext w:val="0"/>
+              <w:keepLines w:val="0"/>
+              <w:spacing w:after="20" w:line="240" w:before="0"/>
+            </w:pPr>
+            <w:r>
+              <w:rPr>
+                <w:rFonts w:ascii="Times New Roman" w:cs="Times New Roman" w:eastAsia="Times New Roman" w:hAnsi="Times New Roman"/>
+                <w:b/>
+                <w:bCs/>
+                <w:i w:val="0"/>
+                <w:color w:val="323539"/>
+                <w:sz w:val="16"/>
                 <w:szCs w:val="22"/>
               </w:rPr>
               <w:t xml:space="preserve">Поле</w:t>
@@ -285,14 +325,18 @@
           </w:tcPr>
           <w:p>
             <w:pPr>
-              <w:spacing w:after="0" w:line="240"/>
-            </w:pPr>
-            <w:r>
-              <w:rPr>
-                <w:rFonts w:ascii="Times New Roman" w:cs="Times New Roman" w:eastAsia="Times New Roman" w:hAnsi="Times New Roman"/>
-                <w:b/>
-                <w:bCs/>
-                <w:sz w:val="22"/>
+              <w:keepNext w:val="0"/>
+              <w:keepLines w:val="0"/>
+              <w:spacing w:after="20" w:line="240" w:before="0"/>
+            </w:pPr>
+            <w:r>
+              <w:rPr>
+                <w:rFonts w:ascii="Times New Roman" w:cs="Times New Roman" w:eastAsia="Times New Roman" w:hAnsi="Times New Roman"/>
+                <w:b/>
+                <w:bCs/>
+                <w:i w:val="0"/>
+                <w:color w:val="323539"/>
+                <w:sz w:val="16"/>
                 <w:szCs w:val="22"/>
               </w:rPr>
               <w:t xml:space="preserve">Что вписать</w:t>
@@ -312,14 +356,18 @@
           </w:tcPr>
           <w:p>
             <w:pPr>
-              <w:spacing w:after="0" w:line="240"/>
-            </w:pPr>
-            <w:r>
-              <w:rPr>
-                <w:rFonts w:ascii="Times New Roman" w:cs="Times New Roman" w:eastAsia="Times New Roman" w:hAnsi="Times New Roman"/>
-                <w:b/>
-                <w:bCs/>
-                <w:sz w:val="22"/>
+              <w:keepNext w:val="0"/>
+              <w:keepLines w:val="0"/>
+              <w:spacing w:after="20" w:line="240" w:before="0"/>
+            </w:pPr>
+            <w:r>
+              <w:rPr>
+                <w:rFonts w:ascii="Times New Roman" w:cs="Times New Roman" w:eastAsia="Times New Roman" w:hAnsi="Times New Roman"/>
+                <w:b/>
+                <w:bCs/>
+                <w:i w:val="0"/>
+                <w:color w:val="323539"/>
+                <w:sz w:val="16"/>
                 <w:szCs w:val="22"/>
               </w:rPr>
               <w:t xml:space="preserve">Откуда взять</w:t>
@@ -340,17 +388,19 @@
           </w:tcPr>
           <w:p>
             <w:pPr>
-              <w:spacing w:after="0" w:line="240"/>
-            </w:pPr>
-            <w:r>
-              <w:rPr>
-                <w:rFonts w:ascii="Times New Roman" w:cs="Times New Roman" w:eastAsia="Times New Roman" w:hAnsi="Times New Roman"/>
-                <w:b/>
-                <w:bCs/>
-                <w:i w:val="false"/>
+              <w:keepNext w:val="0"/>
+              <w:keepLines w:val="0"/>
+              <w:spacing w:after="20" w:line="240" w:before="0"/>
+            </w:pPr>
+            <w:r>
+              <w:rPr>
+                <w:rFonts w:ascii="Times New Roman" w:cs="Times New Roman" w:eastAsia="Times New Roman" w:hAnsi="Times New Roman"/>
+                <w:b/>
+                <w:bCs/>
+                <w:i w:val="0"/>
                 <w:iCs w:val="false"/>
-                <w:color w:val="000000"/>
-                <w:sz w:val="22"/>
+                <w:color w:val="323539"/>
+                <w:sz w:val="16"/>
                 <w:szCs w:val="22"/>
               </w:rPr>
               <w:t xml:space="preserve">{{НАИМЕНОВАНИЕ_ПОДРЯДЧИКА}}</w:t>
@@ -369,14 +419,18 @@
           </w:tcPr>
           <w:p>
             <w:pPr>
-              <w:spacing w:after="0" w:line="240"/>
-            </w:pPr>
-            <w:r>
-              <w:rPr>
-                <w:rFonts w:ascii="Times New Roman" w:cs="Times New Roman" w:eastAsia="Times New Roman" w:hAnsi="Times New Roman"/>
-                <w:b w:val="false"/>
-                <w:bCs w:val="false"/>
-                <w:sz w:val="22"/>
+              <w:keepNext w:val="0"/>
+              <w:keepLines w:val="0"/>
+              <w:spacing w:after="20" w:line="240" w:before="0"/>
+            </w:pPr>
+            <w:r>
+              <w:rPr>
+                <w:rFonts w:ascii="Times New Roman" w:cs="Times New Roman" w:eastAsia="Times New Roman" w:hAnsi="Times New Roman"/>
+                <w:b w:val="false"/>
+                <w:bCs w:val="false"/>
+                <w:i w:val="0"/>
+                <w:color w:val="323539"/>
+                <w:sz w:val="16"/>
                 <w:szCs w:val="22"/>
               </w:rPr>
               <w:t xml:space="preserve">Полное наименование вашей организации</w:t>
@@ -395,14 +449,18 @@
           </w:tcPr>
           <w:p>
             <w:pPr>
-              <w:spacing w:after="0" w:line="240"/>
-            </w:pPr>
-            <w:r>
-              <w:rPr>
-                <w:rFonts w:ascii="Times New Roman" w:cs="Times New Roman" w:eastAsia="Times New Roman" w:hAnsi="Times New Roman"/>
-                <w:b w:val="false"/>
-                <w:bCs w:val="false"/>
-                <w:sz w:val="22"/>
+              <w:keepNext w:val="0"/>
+              <w:keepLines w:val="0"/>
+              <w:spacing w:after="20" w:line="240" w:before="0"/>
+            </w:pPr>
+            <w:r>
+              <w:rPr>
+                <w:rFonts w:ascii="Times New Roman" w:cs="Times New Roman" w:eastAsia="Times New Roman" w:hAnsi="Times New Roman"/>
+                <w:b w:val="false"/>
+                <w:bCs w:val="false"/>
+                <w:i w:val="0"/>
+                <w:color w:val="323539"/>
+                <w:sz w:val="16"/>
                 <w:szCs w:val="22"/>
               </w:rPr>
               <w:t xml:space="preserve">учредительные документы, выписка ЕГРЮЛ</w:t>
@@ -423,17 +481,19 @@
           </w:tcPr>
           <w:p>
             <w:pPr>
-              <w:spacing w:after="0" w:line="240"/>
-            </w:pPr>
-            <w:r>
-              <w:rPr>
-                <w:rFonts w:ascii="Times New Roman" w:cs="Times New Roman" w:eastAsia="Times New Roman" w:hAnsi="Times New Roman"/>
-                <w:b/>
-                <w:bCs/>
-                <w:i w:val="false"/>
+              <w:keepNext w:val="0"/>
+              <w:keepLines w:val="0"/>
+              <w:spacing w:after="20" w:line="240" w:before="0"/>
+            </w:pPr>
+            <w:r>
+              <w:rPr>
+                <w:rFonts w:ascii="Times New Roman" w:cs="Times New Roman" w:eastAsia="Times New Roman" w:hAnsi="Times New Roman"/>
+                <w:b/>
+                <w:bCs/>
+                <w:i w:val="0"/>
                 <w:iCs w:val="false"/>
-                <w:color w:val="000000"/>
-                <w:sz w:val="22"/>
+                <w:color w:val="323539"/>
+                <w:sz w:val="16"/>
                 <w:szCs w:val="22"/>
               </w:rPr>
               <w:t xml:space="preserve">{{ИНН_ПОДРЯДЧИКА}}</w:t>
@@ -443,7 +503,9 @@
                 <w:rFonts w:ascii="Times New Roman" w:cs="Times New Roman" w:eastAsia="Times New Roman" w:hAnsi="Times New Roman"/>
                 <w:b w:val="false"/>
                 <w:bCs w:val="false"/>
-                <w:sz w:val="22"/>
+                <w:i w:val="0"/>
+                <w:color w:val="323539"/>
+                <w:sz w:val="16"/>
                 <w:szCs w:val="22"/>
               </w:rPr>
               <w:t xml:space="preserve">, </w:t>
@@ -453,10 +515,10 @@
                 <w:rFonts w:ascii="Times New Roman" w:cs="Times New Roman" w:eastAsia="Times New Roman" w:hAnsi="Times New Roman"/>
                 <w:b/>
                 <w:bCs/>
-                <w:i w:val="false"/>
+                <w:i w:val="0"/>
                 <w:iCs w:val="false"/>
-                <w:color w:val="000000"/>
-                <w:sz w:val="22"/>
+                <w:color w:val="323539"/>
+                <w:sz w:val="16"/>
                 <w:szCs w:val="22"/>
               </w:rPr>
               <w:t xml:space="preserve">{{ОГРН_ПОДРЯДЧИКА}}</w:t>
@@ -475,14 +537,18 @@
           </w:tcPr>
           <w:p>
             <w:pPr>
-              <w:spacing w:after="0" w:line="240"/>
-            </w:pPr>
-            <w:r>
-              <w:rPr>
-                <w:rFonts w:ascii="Times New Roman" w:cs="Times New Roman" w:eastAsia="Times New Roman" w:hAnsi="Times New Roman"/>
-                <w:b w:val="false"/>
-                <w:bCs w:val="false"/>
-                <w:sz w:val="22"/>
+              <w:keepNext w:val="0"/>
+              <w:keepLines w:val="0"/>
+              <w:spacing w:after="20" w:line="240" w:before="0"/>
+            </w:pPr>
+            <w:r>
+              <w:rPr>
+                <w:rFonts w:ascii="Times New Roman" w:cs="Times New Roman" w:eastAsia="Times New Roman" w:hAnsi="Times New Roman"/>
+                <w:b w:val="false"/>
+                <w:bCs w:val="false"/>
+                <w:i w:val="0"/>
+                <w:color w:val="323539"/>
+                <w:sz w:val="16"/>
                 <w:szCs w:val="22"/>
               </w:rPr>
               <w:t xml:space="preserve">ИНН и ОГРН вашей организации</w:t>
@@ -501,14 +567,18 @@
           </w:tcPr>
           <w:p>
             <w:pPr>
-              <w:spacing w:after="0" w:line="240"/>
-            </w:pPr>
-            <w:r>
-              <w:rPr>
-                <w:rFonts w:ascii="Times New Roman" w:cs="Times New Roman" w:eastAsia="Times New Roman" w:hAnsi="Times New Roman"/>
-                <w:b w:val="false"/>
-                <w:bCs w:val="false"/>
-                <w:sz w:val="22"/>
+              <w:keepNext w:val="0"/>
+              <w:keepLines w:val="0"/>
+              <w:spacing w:after="20" w:line="240" w:before="0"/>
+            </w:pPr>
+            <w:r>
+              <w:rPr>
+                <w:rFonts w:ascii="Times New Roman" w:cs="Times New Roman" w:eastAsia="Times New Roman" w:hAnsi="Times New Roman"/>
+                <w:b w:val="false"/>
+                <w:bCs w:val="false"/>
+                <w:i w:val="0"/>
+                <w:color w:val="323539"/>
+                <w:sz w:val="16"/>
                 <w:szCs w:val="22"/>
               </w:rPr>
               <w:t xml:space="preserve">выписка ЕГРЮЛ</w:t>
@@ -529,17 +599,19 @@
           </w:tcPr>
           <w:p>
             <w:pPr>
-              <w:spacing w:after="0" w:line="240"/>
-            </w:pPr>
-            <w:r>
-              <w:rPr>
-                <w:rFonts w:ascii="Times New Roman" w:cs="Times New Roman" w:eastAsia="Times New Roman" w:hAnsi="Times New Roman"/>
-                <w:b/>
-                <w:bCs/>
-                <w:i w:val="false"/>
+              <w:keepNext w:val="0"/>
+              <w:keepLines w:val="0"/>
+              <w:spacing w:after="20" w:line="240" w:before="0"/>
+            </w:pPr>
+            <w:r>
+              <w:rPr>
+                <w:rFonts w:ascii="Times New Roman" w:cs="Times New Roman" w:eastAsia="Times New Roman" w:hAnsi="Times New Roman"/>
+                <w:b/>
+                <w:bCs/>
+                <w:i w:val="0"/>
                 <w:iCs w:val="false"/>
-                <w:color w:val="000000"/>
-                <w:sz w:val="22"/>
+                <w:color w:val="323539"/>
+                <w:sz w:val="16"/>
                 <w:szCs w:val="22"/>
               </w:rPr>
               <w:t xml:space="preserve">{{АДРЕС_ПОДРЯДЧИКА}}</w:t>
@@ -558,14 +630,18 @@
           </w:tcPr>
           <w:p>
             <w:pPr>
-              <w:spacing w:after="0" w:line="240"/>
-            </w:pPr>
-            <w:r>
-              <w:rPr>
-                <w:rFonts w:ascii="Times New Roman" w:cs="Times New Roman" w:eastAsia="Times New Roman" w:hAnsi="Times New Roman"/>
-                <w:b w:val="false"/>
-                <w:bCs w:val="false"/>
-                <w:sz w:val="22"/>
+              <w:keepNext w:val="0"/>
+              <w:keepLines w:val="0"/>
+              <w:spacing w:after="20" w:line="240" w:before="0"/>
+            </w:pPr>
+            <w:r>
+              <w:rPr>
+                <w:rFonts w:ascii="Times New Roman" w:cs="Times New Roman" w:eastAsia="Times New Roman" w:hAnsi="Times New Roman"/>
+                <w:b w:val="false"/>
+                <w:bCs w:val="false"/>
+                <w:i w:val="0"/>
+                <w:color w:val="323539"/>
+                <w:sz w:val="16"/>
                 <w:szCs w:val="22"/>
               </w:rPr>
               <w:t xml:space="preserve">Юридический адрес вашей организации</w:t>
@@ -584,14 +660,18 @@
           </w:tcPr>
           <w:p>
             <w:pPr>
-              <w:spacing w:after="0" w:line="240"/>
-            </w:pPr>
-            <w:r>
-              <w:rPr>
-                <w:rFonts w:ascii="Times New Roman" w:cs="Times New Roman" w:eastAsia="Times New Roman" w:hAnsi="Times New Roman"/>
-                <w:b w:val="false"/>
-                <w:bCs w:val="false"/>
-                <w:sz w:val="22"/>
+              <w:keepNext w:val="0"/>
+              <w:keepLines w:val="0"/>
+              <w:spacing w:after="20" w:line="240" w:before="0"/>
+            </w:pPr>
+            <w:r>
+              <w:rPr>
+                <w:rFonts w:ascii="Times New Roman" w:cs="Times New Roman" w:eastAsia="Times New Roman" w:hAnsi="Times New Roman"/>
+                <w:b w:val="false"/>
+                <w:bCs w:val="false"/>
+                <w:i w:val="0"/>
+                <w:color w:val="323539"/>
+                <w:sz w:val="16"/>
                 <w:szCs w:val="22"/>
               </w:rPr>
               <w:t xml:space="preserve">выписка ЕГРЮЛ</w:t>
@@ -612,17 +692,19 @@
           </w:tcPr>
           <w:p>
             <w:pPr>
-              <w:spacing w:after="0" w:line="240"/>
-            </w:pPr>
-            <w:r>
-              <w:rPr>
-                <w:rFonts w:ascii="Times New Roman" w:cs="Times New Roman" w:eastAsia="Times New Roman" w:hAnsi="Times New Roman"/>
-                <w:b/>
-                <w:bCs/>
-                <w:i w:val="false"/>
+              <w:keepNext w:val="0"/>
+              <w:keepLines w:val="0"/>
+              <w:spacing w:after="20" w:line="240" w:before="0"/>
+            </w:pPr>
+            <w:r>
+              <w:rPr>
+                <w:rFonts w:ascii="Times New Roman" w:cs="Times New Roman" w:eastAsia="Times New Roman" w:hAnsi="Times New Roman"/>
+                <w:b/>
+                <w:bCs/>
+                <w:i w:val="0"/>
                 <w:iCs w:val="false"/>
-                <w:color w:val="000000"/>
-                <w:sz w:val="22"/>
+                <w:color w:val="323539"/>
+                <w:sz w:val="16"/>
                 <w:szCs w:val="22"/>
               </w:rPr>
               <w:t xml:space="preserve">{{КОНТАКТЫ_ПОДРЯДЧИКА}}</w:t>
@@ -641,17 +723,21 @@
           </w:tcPr>
           <w:p>
             <w:pPr>
-              <w:spacing w:after="0" w:line="240"/>
-            </w:pPr>
-            <w:r>
-              <w:rPr>
-                <w:rFonts w:ascii="Times New Roman" w:cs="Times New Roman" w:eastAsia="Times New Roman" w:hAnsi="Times New Roman"/>
-                <w:b w:val="false"/>
-                <w:bCs w:val="false"/>
-                <w:sz w:val="22"/>
-                <w:szCs w:val="22"/>
-              </w:rPr>
-              <w:t xml:space="preserve">Телефон и адрес электронной почты для суда</w:t>
+              <w:keepNext w:val="0"/>
+              <w:keepLines w:val="0"/>
+              <w:spacing w:after="20" w:line="240" w:before="0"/>
+            </w:pPr>
+            <w:r>
+              <w:rPr>
+                <w:rFonts w:ascii="Times New Roman" w:cs="Times New Roman" w:eastAsia="Times New Roman" w:hAnsi="Times New Roman"/>
+                <w:b w:val="false"/>
+                <w:bCs w:val="false"/>
+                <w:i w:val="0"/>
+                <w:color w:val="323539"/>
+                <w:sz w:val="16"/>
+                <w:szCs w:val="22"/>
+              </w:rPr>
+              <w:t xml:space="preserve">Рабочие телефон и адрес электронной почты для связи</w:t>
             </w:r>
           </w:p>
         </w:tc>
@@ -667,14 +753,18 @@
           </w:tcPr>
           <w:p>
             <w:pPr>
-              <w:spacing w:after="0" w:line="240"/>
-            </w:pPr>
-            <w:r>
-              <w:rPr>
-                <w:rFonts w:ascii="Times New Roman" w:cs="Times New Roman" w:eastAsia="Times New Roman" w:hAnsi="Times New Roman"/>
-                <w:b w:val="false"/>
-                <w:bCs w:val="false"/>
-                <w:sz w:val="22"/>
+              <w:keepNext w:val="0"/>
+              <w:keepLines w:val="0"/>
+              <w:spacing w:after="20" w:line="240" w:before="0"/>
+            </w:pPr>
+            <w:r>
+              <w:rPr>
+                <w:rFonts w:ascii="Times New Roman" w:cs="Times New Roman" w:eastAsia="Times New Roman" w:hAnsi="Times New Roman"/>
+                <w:b w:val="false"/>
+                <w:bCs w:val="false"/>
+                <w:i w:val="0"/>
+                <w:color w:val="323539"/>
+                <w:sz w:val="16"/>
                 <w:szCs w:val="22"/>
               </w:rPr>
               <w:t xml:space="preserve">ваши рабочие контакты</w:t>
@@ -695,17 +785,19 @@
           </w:tcPr>
           <w:p>
             <w:pPr>
-              <w:spacing w:after="0" w:line="240"/>
-            </w:pPr>
-            <w:r>
-              <w:rPr>
-                <w:rFonts w:ascii="Times New Roman" w:cs="Times New Roman" w:eastAsia="Times New Roman" w:hAnsi="Times New Roman"/>
-                <w:b/>
-                <w:bCs/>
-                <w:i w:val="false"/>
+              <w:keepNext w:val="0"/>
+              <w:keepLines w:val="0"/>
+              <w:spacing w:after="20" w:line="240" w:before="0"/>
+            </w:pPr>
+            <w:r>
+              <w:rPr>
+                <w:rFonts w:ascii="Times New Roman" w:cs="Times New Roman" w:eastAsia="Times New Roman" w:hAnsi="Times New Roman"/>
+                <w:b/>
+                <w:bCs/>
+                <w:i w:val="0"/>
                 <w:iCs w:val="false"/>
-                <w:color w:val="000000"/>
-                <w:sz w:val="22"/>
+                <w:color w:val="323539"/>
+                <w:sz w:val="16"/>
                 <w:szCs w:val="22"/>
               </w:rPr>
               <w:t xml:space="preserve">{{БАНКОВСКИЕ_РЕКВИЗИТЫ_ПОДРЯДЧИКА}}</w:t>
@@ -724,14 +816,18 @@
           </w:tcPr>
           <w:p>
             <w:pPr>
-              <w:spacing w:after="0" w:line="240"/>
-            </w:pPr>
-            <w:r>
-              <w:rPr>
-                <w:rFonts w:ascii="Times New Roman" w:cs="Times New Roman" w:eastAsia="Times New Roman" w:hAnsi="Times New Roman"/>
-                <w:b w:val="false"/>
-                <w:bCs w:val="false"/>
-                <w:sz w:val="22"/>
+              <w:keepNext w:val="0"/>
+              <w:keepLines w:val="0"/>
+              <w:spacing w:after="20" w:line="240" w:before="0"/>
+            </w:pPr>
+            <w:r>
+              <w:rPr>
+                <w:rFonts w:ascii="Times New Roman" w:cs="Times New Roman" w:eastAsia="Times New Roman" w:hAnsi="Times New Roman"/>
+                <w:b w:val="false"/>
+                <w:bCs w:val="false"/>
+                <w:i w:val="0"/>
+                <w:color w:val="323539"/>
+                <w:sz w:val="16"/>
                 <w:szCs w:val="22"/>
               </w:rPr>
               <w:t xml:space="preserve">Расчётный счёт, банк, БИК, корсчёт</w:t>
@@ -750,14 +846,18 @@
           </w:tcPr>
           <w:p>
             <w:pPr>
-              <w:spacing w:after="0" w:line="240"/>
-            </w:pPr>
-            <w:r>
-              <w:rPr>
-                <w:rFonts w:ascii="Times New Roman" w:cs="Times New Roman" w:eastAsia="Times New Roman" w:hAnsi="Times New Roman"/>
-                <w:b w:val="false"/>
-                <w:bCs w:val="false"/>
-                <w:sz w:val="22"/>
+              <w:keepNext w:val="0"/>
+              <w:keepLines w:val="0"/>
+              <w:spacing w:after="20" w:line="240" w:before="0"/>
+            </w:pPr>
+            <w:r>
+              <w:rPr>
+                <w:rFonts w:ascii="Times New Roman" w:cs="Times New Roman" w:eastAsia="Times New Roman" w:hAnsi="Times New Roman"/>
+                <w:b w:val="false"/>
+                <w:bCs w:val="false"/>
+                <w:i w:val="0"/>
+                <w:color w:val="323539"/>
+                <w:sz w:val="16"/>
                 <w:szCs w:val="22"/>
               </w:rPr>
               <w:t xml:space="preserve">справка банка</w:t>
@@ -778,17 +878,19 @@
           </w:tcPr>
           <w:p>
             <w:pPr>
-              <w:spacing w:after="0" w:line="240"/>
-            </w:pPr>
-            <w:r>
-              <w:rPr>
-                <w:rFonts w:ascii="Times New Roman" w:cs="Times New Roman" w:eastAsia="Times New Roman" w:hAnsi="Times New Roman"/>
-                <w:b/>
-                <w:bCs/>
-                <w:i w:val="false"/>
+              <w:keepNext w:val="0"/>
+              <w:keepLines w:val="0"/>
+              <w:spacing w:after="20" w:line="240" w:before="0"/>
+            </w:pPr>
+            <w:r>
+              <w:rPr>
+                <w:rFonts w:ascii="Times New Roman" w:cs="Times New Roman" w:eastAsia="Times New Roman" w:hAnsi="Times New Roman"/>
+                <w:b/>
+                <w:bCs/>
+                <w:i w:val="0"/>
                 <w:iCs w:val="false"/>
-                <w:color w:val="000000"/>
-                <w:sz w:val="22"/>
+                <w:color w:val="323539"/>
+                <w:sz w:val="16"/>
                 <w:szCs w:val="22"/>
               </w:rPr>
               <w:t xml:space="preserve">{{НАИМЕНОВАНИЕ_ЗАКАЗЧИКА}}</w:t>
@@ -807,14 +909,18 @@
           </w:tcPr>
           <w:p>
             <w:pPr>
-              <w:spacing w:after="0" w:line="240"/>
-            </w:pPr>
-            <w:r>
-              <w:rPr>
-                <w:rFonts w:ascii="Times New Roman" w:cs="Times New Roman" w:eastAsia="Times New Roman" w:hAnsi="Times New Roman"/>
-                <w:b w:val="false"/>
-                <w:bCs w:val="false"/>
-                <w:sz w:val="22"/>
+              <w:keepNext w:val="0"/>
+              <w:keepLines w:val="0"/>
+              <w:spacing w:after="20" w:line="240" w:before="0"/>
+            </w:pPr>
+            <w:r>
+              <w:rPr>
+                <w:rFonts w:ascii="Times New Roman" w:cs="Times New Roman" w:eastAsia="Times New Roman" w:hAnsi="Times New Roman"/>
+                <w:b w:val="false"/>
+                <w:bCs w:val="false"/>
+                <w:i w:val="0"/>
+                <w:color w:val="323539"/>
+                <w:sz w:val="16"/>
                 <w:szCs w:val="22"/>
               </w:rPr>
               <w:t xml:space="preserve">Полное наименование должника — стороны договора, обязанной платить</w:t>
@@ -833,14 +939,18 @@
           </w:tcPr>
           <w:p>
             <w:pPr>
-              <w:spacing w:after="0" w:line="240"/>
-            </w:pPr>
-            <w:r>
-              <w:rPr>
-                <w:rFonts w:ascii="Times New Roman" w:cs="Times New Roman" w:eastAsia="Times New Roman" w:hAnsi="Times New Roman"/>
-                <w:b w:val="false"/>
-                <w:bCs w:val="false"/>
-                <w:sz w:val="22"/>
+              <w:keepNext w:val="0"/>
+              <w:keepLines w:val="0"/>
+              <w:spacing w:after="20" w:line="240" w:before="0"/>
+            </w:pPr>
+            <w:r>
+              <w:rPr>
+                <w:rFonts w:ascii="Times New Roman" w:cs="Times New Roman" w:eastAsia="Times New Roman" w:hAnsi="Times New Roman"/>
+                <w:b w:val="false"/>
+                <w:bCs w:val="false"/>
+                <w:i w:val="0"/>
+                <w:color w:val="323539"/>
+                <w:sz w:val="16"/>
                 <w:szCs w:val="22"/>
               </w:rPr>
               <w:t xml:space="preserve">договор и актуальная выписка ЕГРЮЛ</w:t>
@@ -861,17 +971,19 @@
           </w:tcPr>
           <w:p>
             <w:pPr>
-              <w:spacing w:after="0" w:line="240"/>
-            </w:pPr>
-            <w:r>
-              <w:rPr>
-                <w:rFonts w:ascii="Times New Roman" w:cs="Times New Roman" w:eastAsia="Times New Roman" w:hAnsi="Times New Roman"/>
-                <w:b/>
-                <w:bCs/>
-                <w:i w:val="false"/>
+              <w:keepNext w:val="0"/>
+              <w:keepLines w:val="0"/>
+              <w:spacing w:after="20" w:line="240" w:before="0"/>
+            </w:pPr>
+            <w:r>
+              <w:rPr>
+                <w:rFonts w:ascii="Times New Roman" w:cs="Times New Roman" w:eastAsia="Times New Roman" w:hAnsi="Times New Roman"/>
+                <w:b/>
+                <w:bCs/>
+                <w:i w:val="0"/>
                 <w:iCs w:val="false"/>
-                <w:color w:val="000000"/>
-                <w:sz w:val="22"/>
+                <w:color w:val="323539"/>
+                <w:sz w:val="16"/>
                 <w:szCs w:val="22"/>
               </w:rPr>
               <w:t xml:space="preserve">{{ИНН_ЗАКАЗЧИКА}}</w:t>
@@ -881,7 +993,9 @@
                 <w:rFonts w:ascii="Times New Roman" w:cs="Times New Roman" w:eastAsia="Times New Roman" w:hAnsi="Times New Roman"/>
                 <w:b w:val="false"/>
                 <w:bCs w:val="false"/>
-                <w:sz w:val="22"/>
+                <w:i w:val="0"/>
+                <w:color w:val="323539"/>
+                <w:sz w:val="16"/>
                 <w:szCs w:val="22"/>
               </w:rPr>
               <w:t xml:space="preserve">, </w:t>
@@ -891,10 +1005,10 @@
                 <w:rFonts w:ascii="Times New Roman" w:cs="Times New Roman" w:eastAsia="Times New Roman" w:hAnsi="Times New Roman"/>
                 <w:b/>
                 <w:bCs/>
-                <w:i w:val="false"/>
+                <w:i w:val="0"/>
                 <w:iCs w:val="false"/>
-                <w:color w:val="000000"/>
-                <w:sz w:val="22"/>
+                <w:color w:val="323539"/>
+                <w:sz w:val="16"/>
                 <w:szCs w:val="22"/>
               </w:rPr>
               <w:t xml:space="preserve">{{ОГРН_ЗАКАЗЧИКА}}</w:t>
@@ -913,14 +1027,18 @@
           </w:tcPr>
           <w:p>
             <w:pPr>
-              <w:spacing w:after="0" w:line="240"/>
-            </w:pPr>
-            <w:r>
-              <w:rPr>
-                <w:rFonts w:ascii="Times New Roman" w:cs="Times New Roman" w:eastAsia="Times New Roman" w:hAnsi="Times New Roman"/>
-                <w:b w:val="false"/>
-                <w:bCs w:val="false"/>
-                <w:sz w:val="22"/>
+              <w:keepNext w:val="0"/>
+              <w:keepLines w:val="0"/>
+              <w:spacing w:after="20" w:line="240" w:before="0"/>
+            </w:pPr>
+            <w:r>
+              <w:rPr>
+                <w:rFonts w:ascii="Times New Roman" w:cs="Times New Roman" w:eastAsia="Times New Roman" w:hAnsi="Times New Roman"/>
+                <w:b w:val="false"/>
+                <w:bCs w:val="false"/>
+                <w:i w:val="0"/>
+                <w:color w:val="323539"/>
+                <w:sz w:val="16"/>
                 <w:szCs w:val="22"/>
               </w:rPr>
               <w:t xml:space="preserve">ИНН и ОГРН должника</w:t>
@@ -939,14 +1057,18 @@
           </w:tcPr>
           <w:p>
             <w:pPr>
-              <w:spacing w:after="0" w:line="240"/>
-            </w:pPr>
-            <w:r>
-              <w:rPr>
-                <w:rFonts w:ascii="Times New Roman" w:cs="Times New Roman" w:eastAsia="Times New Roman" w:hAnsi="Times New Roman"/>
-                <w:b w:val="false"/>
-                <w:bCs w:val="false"/>
-                <w:sz w:val="22"/>
+              <w:keepNext w:val="0"/>
+              <w:keepLines w:val="0"/>
+              <w:spacing w:after="20" w:line="240" w:before="0"/>
+            </w:pPr>
+            <w:r>
+              <w:rPr>
+                <w:rFonts w:ascii="Times New Roman" w:cs="Times New Roman" w:eastAsia="Times New Roman" w:hAnsi="Times New Roman"/>
+                <w:b w:val="false"/>
+                <w:bCs w:val="false"/>
+                <w:i w:val="0"/>
+                <w:color w:val="323539"/>
+                <w:sz w:val="16"/>
                 <w:szCs w:val="22"/>
               </w:rPr>
               <w:t xml:space="preserve">выписка ЕГРЮЛ; для иска они обязательны (ст. 125 АПК РФ)</w:t>
@@ -967,17 +1089,19 @@
           </w:tcPr>
           <w:p>
             <w:pPr>
-              <w:spacing w:after="0" w:line="240"/>
-            </w:pPr>
-            <w:r>
-              <w:rPr>
-                <w:rFonts w:ascii="Times New Roman" w:cs="Times New Roman" w:eastAsia="Times New Roman" w:hAnsi="Times New Roman"/>
-                <w:b/>
-                <w:bCs/>
-                <w:i w:val="false"/>
+              <w:keepNext w:val="0"/>
+              <w:keepLines w:val="0"/>
+              <w:spacing w:after="20" w:line="240" w:before="0"/>
+            </w:pPr>
+            <w:r>
+              <w:rPr>
+                <w:rFonts w:ascii="Times New Roman" w:cs="Times New Roman" w:eastAsia="Times New Roman" w:hAnsi="Times New Roman"/>
+                <w:b/>
+                <w:bCs/>
+                <w:i w:val="0"/>
                 <w:iCs w:val="false"/>
-                <w:color w:val="000000"/>
-                <w:sz w:val="22"/>
+                <w:color w:val="323539"/>
+                <w:sz w:val="16"/>
                 <w:szCs w:val="22"/>
               </w:rPr>
               <w:t xml:space="preserve">{{АДРЕС_ЗАКАЗЧИКА}}</w:t>
@@ -996,14 +1120,18 @@
           </w:tcPr>
           <w:p>
             <w:pPr>
-              <w:spacing w:after="0" w:line="240"/>
-            </w:pPr>
-            <w:r>
-              <w:rPr>
-                <w:rFonts w:ascii="Times New Roman" w:cs="Times New Roman" w:eastAsia="Times New Roman" w:hAnsi="Times New Roman"/>
-                <w:b w:val="false"/>
-                <w:bCs w:val="false"/>
-                <w:sz w:val="22"/>
+              <w:keepNext w:val="0"/>
+              <w:keepLines w:val="0"/>
+              <w:spacing w:after="20" w:line="240" w:before="0"/>
+            </w:pPr>
+            <w:r>
+              <w:rPr>
+                <w:rFonts w:ascii="Times New Roman" w:cs="Times New Roman" w:eastAsia="Times New Roman" w:hAnsi="Times New Roman"/>
+                <w:b w:val="false"/>
+                <w:bCs w:val="false"/>
+                <w:i w:val="0"/>
+                <w:color w:val="323539"/>
+                <w:sz w:val="16"/>
                 <w:szCs w:val="22"/>
               </w:rPr>
               <w:t xml:space="preserve">Юридический адрес должника</w:t>
@@ -1022,14 +1150,18 @@
           </w:tcPr>
           <w:p>
             <w:pPr>
-              <w:spacing w:after="0" w:line="240"/>
-            </w:pPr>
-            <w:r>
-              <w:rPr>
-                <w:rFonts w:ascii="Times New Roman" w:cs="Times New Roman" w:eastAsia="Times New Roman" w:hAnsi="Times New Roman"/>
-                <w:b w:val="false"/>
-                <w:bCs w:val="false"/>
-                <w:sz w:val="22"/>
+              <w:keepNext w:val="0"/>
+              <w:keepLines w:val="0"/>
+              <w:spacing w:after="20" w:line="240" w:before="0"/>
+            </w:pPr>
+            <w:r>
+              <w:rPr>
+                <w:rFonts w:ascii="Times New Roman" w:cs="Times New Roman" w:eastAsia="Times New Roman" w:hAnsi="Times New Roman"/>
+                <w:b w:val="false"/>
+                <w:bCs w:val="false"/>
+                <w:i w:val="0"/>
+                <w:color w:val="323539"/>
+                <w:sz w:val="16"/>
                 <w:szCs w:val="22"/>
               </w:rPr>
               <w:t xml:space="preserve">свежая выписка ЕГРЮЛ, а не шапка договора: адрес мог смениться</w:t>
@@ -1050,17 +1182,19 @@
           </w:tcPr>
           <w:p>
             <w:pPr>
-              <w:spacing w:after="0" w:line="240"/>
-            </w:pPr>
-            <w:r>
-              <w:rPr>
-                <w:rFonts w:ascii="Times New Roman" w:cs="Times New Roman" w:eastAsia="Times New Roman" w:hAnsi="Times New Roman"/>
-                <w:b/>
-                <w:bCs/>
-                <w:i w:val="false"/>
+              <w:keepNext w:val="0"/>
+              <w:keepLines w:val="0"/>
+              <w:spacing w:after="20" w:line="240" w:before="0"/>
+            </w:pPr>
+            <w:r>
+              <w:rPr>
+                <w:rFonts w:ascii="Times New Roman" w:cs="Times New Roman" w:eastAsia="Times New Roman" w:hAnsi="Times New Roman"/>
+                <w:b/>
+                <w:bCs/>
+                <w:i w:val="0"/>
                 <w:iCs w:val="false"/>
-                <w:color w:val="000000"/>
-                <w:sz w:val="22"/>
+                <w:color w:val="323539"/>
+                <w:sz w:val="16"/>
                 <w:szCs w:val="22"/>
               </w:rPr>
               <w:t xml:space="preserve">{{ДОЛЖНОСТЬ_ПОДПИСАНТА}}</w:t>
@@ -1070,7 +1204,9 @@
                 <w:rFonts w:ascii="Times New Roman" w:cs="Times New Roman" w:eastAsia="Times New Roman" w:hAnsi="Times New Roman"/>
                 <w:b w:val="false"/>
                 <w:bCs w:val="false"/>
-                <w:sz w:val="22"/>
+                <w:i w:val="0"/>
+                <w:color w:val="323539"/>
+                <w:sz w:val="16"/>
                 <w:szCs w:val="22"/>
               </w:rPr>
               <w:t xml:space="preserve">, </w:t>
@@ -1080,10 +1216,10 @@
                 <w:rFonts w:ascii="Times New Roman" w:cs="Times New Roman" w:eastAsia="Times New Roman" w:hAnsi="Times New Roman"/>
                 <w:b/>
                 <w:bCs/>
-                <w:i w:val="false"/>
+                <w:i w:val="0"/>
                 <w:iCs w:val="false"/>
-                <w:color w:val="000000"/>
-                <w:sz w:val="22"/>
+                <w:color w:val="323539"/>
+                <w:sz w:val="16"/>
                 <w:szCs w:val="22"/>
               </w:rPr>
               <w:t xml:space="preserve">{{ФИО_ПОДПИСАНТА}}</w:t>
@@ -1102,14 +1238,18 @@
           </w:tcPr>
           <w:p>
             <w:pPr>
-              <w:spacing w:after="0" w:line="240"/>
-            </w:pPr>
-            <w:r>
-              <w:rPr>
-                <w:rFonts w:ascii="Times New Roman" w:cs="Times New Roman" w:eastAsia="Times New Roman" w:hAnsi="Times New Roman"/>
-                <w:b w:val="false"/>
-                <w:bCs w:val="false"/>
-                <w:sz w:val="22"/>
+              <w:keepNext w:val="0"/>
+              <w:keepLines w:val="0"/>
+              <w:spacing w:after="20" w:line="240" w:before="0"/>
+            </w:pPr>
+            <w:r>
+              <w:rPr>
+                <w:rFonts w:ascii="Times New Roman" w:cs="Times New Roman" w:eastAsia="Times New Roman" w:hAnsi="Times New Roman"/>
+                <w:b w:val="false"/>
+                <w:bCs w:val="false"/>
+                <w:i w:val="0"/>
+                <w:color w:val="323539"/>
+                <w:sz w:val="16"/>
                 <w:szCs w:val="22"/>
               </w:rPr>
               <w:t xml:space="preserve">Кто подписывает от вашей организации</w:t>
@@ -1128,14 +1268,18 @@
           </w:tcPr>
           <w:p>
             <w:pPr>
-              <w:spacing w:after="0" w:line="240"/>
-            </w:pPr>
-            <w:r>
-              <w:rPr>
-                <w:rFonts w:ascii="Times New Roman" w:cs="Times New Roman" w:eastAsia="Times New Roman" w:hAnsi="Times New Roman"/>
-                <w:b w:val="false"/>
-                <w:bCs w:val="false"/>
-                <w:sz w:val="22"/>
+              <w:keepNext w:val="0"/>
+              <w:keepLines w:val="0"/>
+              <w:spacing w:after="20" w:line="240" w:before="0"/>
+            </w:pPr>
+            <w:r>
+              <w:rPr>
+                <w:rFonts w:ascii="Times New Roman" w:cs="Times New Roman" w:eastAsia="Times New Roman" w:hAnsi="Times New Roman"/>
+                <w:b w:val="false"/>
+                <w:bCs w:val="false"/>
+                <w:i w:val="0"/>
+                <w:color w:val="323539"/>
+                <w:sz w:val="16"/>
                 <w:szCs w:val="22"/>
               </w:rPr>
               <w:t xml:space="preserve">устав, доверенность</w:t>
@@ -1156,17 +1300,19 @@
           </w:tcPr>
           <w:p>
             <w:pPr>
-              <w:spacing w:after="0" w:line="240"/>
-            </w:pPr>
-            <w:r>
-              <w:rPr>
-                <w:rFonts w:ascii="Times New Roman" w:cs="Times New Roman" w:eastAsia="Times New Roman" w:hAnsi="Times New Roman"/>
-                <w:b/>
-                <w:bCs/>
-                <w:i w:val="false"/>
+              <w:keepNext w:val="0"/>
+              <w:keepLines w:val="0"/>
+              <w:spacing w:after="20" w:line="240" w:before="0"/>
+            </w:pPr>
+            <w:r>
+              <w:rPr>
+                <w:rFonts w:ascii="Times New Roman" w:cs="Times New Roman" w:eastAsia="Times New Roman" w:hAnsi="Times New Roman"/>
+                <w:b/>
+                <w:bCs/>
+                <w:i w:val="0"/>
                 <w:iCs w:val="false"/>
-                <w:color w:val="000000"/>
-                <w:sz w:val="22"/>
+                <w:color w:val="323539"/>
+                <w:sz w:val="16"/>
                 <w:szCs w:val="22"/>
               </w:rPr>
               <w:t xml:space="preserve">{{ОСНОВАНИЕ_ПОЛНОМОЧИЙ}}</w:t>
@@ -1185,14 +1331,18 @@
           </w:tcPr>
           <w:p>
             <w:pPr>
-              <w:spacing w:after="0" w:line="240"/>
-            </w:pPr>
-            <w:r>
-              <w:rPr>
-                <w:rFonts w:ascii="Times New Roman" w:cs="Times New Roman" w:eastAsia="Times New Roman" w:hAnsi="Times New Roman"/>
-                <w:b w:val="false"/>
-                <w:bCs w:val="false"/>
-                <w:sz w:val="22"/>
+              <w:keepNext w:val="0"/>
+              <w:keepLines w:val="0"/>
+              <w:spacing w:after="20" w:line="240" w:before="0"/>
+            </w:pPr>
+            <w:r>
+              <w:rPr>
+                <w:rFonts w:ascii="Times New Roman" w:cs="Times New Roman" w:eastAsia="Times New Roman" w:hAnsi="Times New Roman"/>
+                <w:b w:val="false"/>
+                <w:bCs w:val="false"/>
+                <w:i w:val="0"/>
+                <w:color w:val="323539"/>
+                <w:sz w:val="16"/>
                 <w:szCs w:val="22"/>
               </w:rPr>
               <w:t xml:space="preserve">«действующего на основании Устава» либо реквизиты доверенности</w:t>
@@ -1211,14 +1361,18 @@
           </w:tcPr>
           <w:p>
             <w:pPr>
-              <w:spacing w:after="0" w:line="240"/>
-            </w:pPr>
-            <w:r>
-              <w:rPr>
-                <w:rFonts w:ascii="Times New Roman" w:cs="Times New Roman" w:eastAsia="Times New Roman" w:hAnsi="Times New Roman"/>
-                <w:b w:val="false"/>
-                <w:bCs w:val="false"/>
-                <w:sz w:val="22"/>
+              <w:keepNext w:val="0"/>
+              <w:keepLines w:val="0"/>
+              <w:spacing w:after="20" w:line="240" w:before="0"/>
+            </w:pPr>
+            <w:r>
+              <w:rPr>
+                <w:rFonts w:ascii="Times New Roman" w:cs="Times New Roman" w:eastAsia="Times New Roman" w:hAnsi="Times New Roman"/>
+                <w:b w:val="false"/>
+                <w:bCs w:val="false"/>
+                <w:i w:val="0"/>
+                <w:color w:val="323539"/>
+                <w:sz w:val="16"/>
                 <w:szCs w:val="22"/>
               </w:rPr>
               <w:t xml:space="preserve">устав, доверенность</w:t>
@@ -1229,20 +1383,22 @@
     </w:tbl>
     <w:p>
       <w:pPr>
-        <w:spacing w:after="120" w:line="276"/>
+        <w:spacing w:after="60" w:line="259" w:before="0" w:lineRule="auto"/>
       </w:pPr>
     </w:p>
     <w:p>
       <w:pPr>
         <w:pStyle w:val="Heading2"/>
         <w:keepNext/>
-        <w:spacing w:after="120" w:before="260"/>
+        <w:spacing w:after="60" w:before="0"/>
       </w:pPr>
       <w:r>
         <w:rPr>
           <w:rFonts w:ascii="Times New Roman" w:cs="Times New Roman" w:eastAsia="Times New Roman" w:hAnsi="Times New Roman"/>
           <w:b/>
           <w:bCs/>
+          <w:i w:val="0"/>
+          <w:color w:val="323539"/>
           <w:sz w:val="26"/>
           <w:szCs w:val="26"/>
         </w:rPr>
@@ -1260,11 +1416,12 @@
           <w:insideH w:val="single" w:color="auto" w:sz="4"/>
           <w:insideV w:val="single" w:color="auto" w:sz="4"/>
         </w:tblBorders>
+        <w:tblLayout w:type="fixed"/>
       </w:tblPr>
       <w:tblGrid>
-        <w:gridCol w:w="3200"/>
-        <w:gridCol w:w="3300"/>
-        <w:gridCol w:w="2860"/>
+        <w:gridCol w:w="3798"/>
+        <w:gridCol w:w="3458"/>
+        <w:gridCol w:w="2551"/>
       </w:tblGrid>
       <w:tr>
         <w:trPr>
@@ -1283,14 +1440,18 @@
           </w:tcPr>
           <w:p>
             <w:pPr>
-              <w:spacing w:after="0" w:line="240"/>
-            </w:pPr>
-            <w:r>
-              <w:rPr>
-                <w:rFonts w:ascii="Times New Roman" w:cs="Times New Roman" w:eastAsia="Times New Roman" w:hAnsi="Times New Roman"/>
-                <w:b/>
-                <w:bCs/>
-                <w:sz w:val="22"/>
+              <w:keepNext w:val="0"/>
+              <w:keepLines w:val="0"/>
+              <w:spacing w:after="20" w:line="240" w:before="0"/>
+            </w:pPr>
+            <w:r>
+              <w:rPr>
+                <w:rFonts w:ascii="Times New Roman" w:cs="Times New Roman" w:eastAsia="Times New Roman" w:hAnsi="Times New Roman"/>
+                <w:b/>
+                <w:bCs/>
+                <w:i w:val="0"/>
+                <w:color w:val="323539"/>
+                <w:sz w:val="16"/>
                 <w:szCs w:val="22"/>
               </w:rPr>
               <w:t xml:space="preserve">Поле</w:t>
@@ -1310,14 +1471,18 @@
           </w:tcPr>
           <w:p>
             <w:pPr>
-              <w:spacing w:after="0" w:line="240"/>
-            </w:pPr>
-            <w:r>
-              <w:rPr>
-                <w:rFonts w:ascii="Times New Roman" w:cs="Times New Roman" w:eastAsia="Times New Roman" w:hAnsi="Times New Roman"/>
-                <w:b/>
-                <w:bCs/>
-                <w:sz w:val="22"/>
+              <w:keepNext w:val="0"/>
+              <w:keepLines w:val="0"/>
+              <w:spacing w:after="20" w:line="240" w:before="0"/>
+            </w:pPr>
+            <w:r>
+              <w:rPr>
+                <w:rFonts w:ascii="Times New Roman" w:cs="Times New Roman" w:eastAsia="Times New Roman" w:hAnsi="Times New Roman"/>
+                <w:b/>
+                <w:bCs/>
+                <w:i w:val="0"/>
+                <w:color w:val="323539"/>
+                <w:sz w:val="16"/>
                 <w:szCs w:val="22"/>
               </w:rPr>
               <w:t xml:space="preserve">Что вписать</w:t>
@@ -1337,14 +1502,18 @@
           </w:tcPr>
           <w:p>
             <w:pPr>
-              <w:spacing w:after="0" w:line="240"/>
-            </w:pPr>
-            <w:r>
-              <w:rPr>
-                <w:rFonts w:ascii="Times New Roman" w:cs="Times New Roman" w:eastAsia="Times New Roman" w:hAnsi="Times New Roman"/>
-                <w:b/>
-                <w:bCs/>
-                <w:sz w:val="22"/>
+              <w:keepNext w:val="0"/>
+              <w:keepLines w:val="0"/>
+              <w:spacing w:after="20" w:line="240" w:before="0"/>
+            </w:pPr>
+            <w:r>
+              <w:rPr>
+                <w:rFonts w:ascii="Times New Roman" w:cs="Times New Roman" w:eastAsia="Times New Roman" w:hAnsi="Times New Roman"/>
+                <w:b/>
+                <w:bCs/>
+                <w:i w:val="0"/>
+                <w:color w:val="323539"/>
+                <w:sz w:val="16"/>
                 <w:szCs w:val="22"/>
               </w:rPr>
               <w:t xml:space="preserve">Откуда взять</w:t>
@@ -1365,17 +1534,19 @@
           </w:tcPr>
           <w:p>
             <w:pPr>
-              <w:spacing w:after="0" w:line="240"/>
-            </w:pPr>
-            <w:r>
-              <w:rPr>
-                <w:rFonts w:ascii="Times New Roman" w:cs="Times New Roman" w:eastAsia="Times New Roman" w:hAnsi="Times New Roman"/>
-                <w:b/>
-                <w:bCs/>
-                <w:i w:val="false"/>
+              <w:keepNext w:val="0"/>
+              <w:keepLines w:val="0"/>
+              <w:spacing w:after="20" w:line="240" w:before="0"/>
+            </w:pPr>
+            <w:r>
+              <w:rPr>
+                <w:rFonts w:ascii="Times New Roman" w:cs="Times New Roman" w:eastAsia="Times New Roman" w:hAnsi="Times New Roman"/>
+                <w:b/>
+                <w:bCs/>
+                <w:i w:val="0"/>
                 <w:iCs w:val="false"/>
-                <w:color w:val="000000"/>
-                <w:sz w:val="22"/>
+                <w:color w:val="323539"/>
+                <w:sz w:val="16"/>
                 <w:szCs w:val="22"/>
               </w:rPr>
               <w:t xml:space="preserve">{{НАИМЕНОВАНИЕ_АДРЕСАТА}}</w:t>
@@ -1385,7 +1556,9 @@
                 <w:rFonts w:ascii="Times New Roman" w:cs="Times New Roman" w:eastAsia="Times New Roman" w:hAnsi="Times New Roman"/>
                 <w:b w:val="false"/>
                 <w:bCs w:val="false"/>
-                <w:sz w:val="22"/>
+                <w:i w:val="0"/>
+                <w:color w:val="323539"/>
+                <w:sz w:val="16"/>
                 <w:szCs w:val="22"/>
               </w:rPr>
               <w:t xml:space="preserve">, </w:t>
@@ -1395,10 +1568,10 @@
                 <w:rFonts w:ascii="Times New Roman" w:cs="Times New Roman" w:eastAsia="Times New Roman" w:hAnsi="Times New Roman"/>
                 <w:b/>
                 <w:bCs/>
-                <w:i w:val="false"/>
+                <w:i w:val="0"/>
                 <w:iCs w:val="false"/>
-                <w:color w:val="000000"/>
-                <w:sz w:val="22"/>
+                <w:color w:val="323539"/>
+                <w:sz w:val="16"/>
                 <w:szCs w:val="22"/>
               </w:rPr>
               <w:t xml:space="preserve">{{АДРЕС_АДРЕСАТА}}</w:t>
@@ -1417,14 +1590,18 @@
           </w:tcPr>
           <w:p>
             <w:pPr>
-              <w:spacing w:after="0" w:line="240"/>
-            </w:pPr>
-            <w:r>
-              <w:rPr>
-                <w:rFonts w:ascii="Times New Roman" w:cs="Times New Roman" w:eastAsia="Times New Roman" w:hAnsi="Times New Roman"/>
-                <w:b w:val="false"/>
-                <w:bCs w:val="false"/>
-                <w:sz w:val="22"/>
+              <w:keepNext w:val="0"/>
+              <w:keepLines w:val="0"/>
+              <w:spacing w:after="20" w:line="240" w:before="0"/>
+            </w:pPr>
+            <w:r>
+              <w:rPr>
+                <w:rFonts w:ascii="Times New Roman" w:cs="Times New Roman" w:eastAsia="Times New Roman" w:hAnsi="Times New Roman"/>
+                <w:b w:val="false"/>
+                <w:bCs w:val="false"/>
+                <w:i w:val="0"/>
+                <w:color w:val="323539"/>
+                <w:sz w:val="16"/>
                 <w:szCs w:val="22"/>
               </w:rPr>
               <w:t xml:space="preserve">Кому направляется запрос о статусе объекта: ваша сторона по договору либо застройщик</w:t>
@@ -1443,14 +1620,18 @@
           </w:tcPr>
           <w:p>
             <w:pPr>
-              <w:spacing w:after="0" w:line="240"/>
-            </w:pPr>
-            <w:r>
-              <w:rPr>
-                <w:rFonts w:ascii="Times New Roman" w:cs="Times New Roman" w:eastAsia="Times New Roman" w:hAnsi="Times New Roman"/>
-                <w:b w:val="false"/>
-                <w:bCs w:val="false"/>
-                <w:sz w:val="22"/>
+              <w:keepNext w:val="0"/>
+              <w:keepLines w:val="0"/>
+              <w:spacing w:after="20" w:line="240" w:before="0"/>
+            </w:pPr>
+            <w:r>
+              <w:rPr>
+                <w:rFonts w:ascii="Times New Roman" w:cs="Times New Roman" w:eastAsia="Times New Roman" w:hAnsi="Times New Roman"/>
+                <w:b w:val="false"/>
+                <w:bCs w:val="false"/>
+                <w:i w:val="0"/>
+                <w:color w:val="323539"/>
+                <w:sz w:val="16"/>
                 <w:szCs w:val="22"/>
               </w:rPr>
               <w:t xml:space="preserve">договор, свежая выписка ЕГРЮЛ</w:t>
@@ -1471,17 +1652,19 @@
           </w:tcPr>
           <w:p>
             <w:pPr>
-              <w:spacing w:after="0" w:line="240"/>
-            </w:pPr>
-            <w:r>
-              <w:rPr>
-                <w:rFonts w:ascii="Times New Roman" w:cs="Times New Roman" w:eastAsia="Times New Roman" w:hAnsi="Times New Roman"/>
-                <w:b/>
-                <w:bCs/>
-                <w:i w:val="false"/>
+              <w:keepNext w:val="0"/>
+              <w:keepLines w:val="0"/>
+              <w:spacing w:after="20" w:line="240" w:before="0"/>
+            </w:pPr>
+            <w:r>
+              <w:rPr>
+                <w:rFonts w:ascii="Times New Roman" w:cs="Times New Roman" w:eastAsia="Times New Roman" w:hAnsi="Times New Roman"/>
+                <w:b/>
+                <w:bCs/>
+                <w:i w:val="0"/>
                 <w:iCs w:val="false"/>
-                <w:color w:val="000000"/>
-                <w:sz w:val="22"/>
+                <w:color w:val="323539"/>
+                <w:sz w:val="16"/>
                 <w:szCs w:val="22"/>
               </w:rPr>
               <w:t xml:space="preserve">{{НАИМЕНОВАНИЕ_ЦЕДЕНТА_ИЛИ_ЗАСТРОЙЩИКА}}</w:t>
@@ -1500,17 +1683,21 @@
           </w:tcPr>
           <w:p>
             <w:pPr>
-              <w:spacing w:after="0" w:line="240"/>
-            </w:pPr>
-            <w:r>
-              <w:rPr>
-                <w:rFonts w:ascii="Times New Roman" w:cs="Times New Roman" w:eastAsia="Times New Roman" w:hAnsi="Times New Roman"/>
-                <w:b w:val="false"/>
-                <w:bCs w:val="false"/>
-                <w:sz w:val="22"/>
-                <w:szCs w:val="22"/>
-              </w:rPr>
-              <w:t xml:space="preserve">Адресат запроса о состоянии счёта эскроу: текущий участник долевого строительства (цедент) либо застройщик</w:t>
+              <w:keepNext w:val="0"/>
+              <w:keepLines w:val="0"/>
+              <w:spacing w:after="20" w:line="240" w:before="0"/>
+            </w:pPr>
+            <w:r>
+              <w:rPr>
+                <w:rFonts w:ascii="Times New Roman" w:cs="Times New Roman" w:eastAsia="Times New Roman" w:hAnsi="Times New Roman"/>
+                <w:b w:val="false"/>
+                <w:bCs w:val="false"/>
+                <w:i w:val="0"/>
+                <w:color w:val="323539"/>
+                <w:sz w:val="16"/>
+                <w:szCs w:val="22"/>
+              </w:rPr>
+              <w:t>Адресат запроса о наполнении счёта эскроу: текущий участник долевого строительства (цедент) либо застройщик</w:t>
             </w:r>
           </w:p>
         </w:tc>
@@ -1526,14 +1713,18 @@
           </w:tcPr>
           <w:p>
             <w:pPr>
-              <w:spacing w:after="0" w:line="240"/>
-            </w:pPr>
-            <w:r>
-              <w:rPr>
-                <w:rFonts w:ascii="Times New Roman" w:cs="Times New Roman" w:eastAsia="Times New Roman" w:hAnsi="Times New Roman"/>
-                <w:b w:val="false"/>
-                <w:bCs w:val="false"/>
-                <w:sz w:val="22"/>
+              <w:keepNext w:val="0"/>
+              <w:keepLines w:val="0"/>
+              <w:spacing w:after="20" w:line="240" w:before="0"/>
+            </w:pPr>
+            <w:r>
+              <w:rPr>
+                <w:rFonts w:ascii="Times New Roman" w:cs="Times New Roman" w:eastAsia="Times New Roman" w:hAnsi="Times New Roman"/>
+                <w:b w:val="false"/>
+                <w:bCs w:val="false"/>
+                <w:i w:val="0"/>
+                <w:color w:val="323539"/>
+                <w:sz w:val="16"/>
                 <w:szCs w:val="22"/>
               </w:rPr>
               <w:t xml:space="preserve">проект договора уступки, ДДУ, выписка ЕГРЮЛ</w:t>
@@ -1554,17 +1745,19 @@
           </w:tcPr>
           <w:p>
             <w:pPr>
-              <w:spacing w:after="0" w:line="240"/>
-            </w:pPr>
-            <w:r>
-              <w:rPr>
-                <w:rFonts w:ascii="Times New Roman" w:cs="Times New Roman" w:eastAsia="Times New Roman" w:hAnsi="Times New Roman"/>
-                <w:b/>
-                <w:bCs/>
-                <w:i w:val="false"/>
+              <w:keepNext w:val="0"/>
+              <w:keepLines w:val="0"/>
+              <w:spacing w:after="20" w:line="240" w:before="0"/>
+            </w:pPr>
+            <w:r>
+              <w:rPr>
+                <w:rFonts w:ascii="Times New Roman" w:cs="Times New Roman" w:eastAsia="Times New Roman" w:hAnsi="Times New Roman"/>
+                <w:b/>
+                <w:bCs/>
+                <w:i w:val="0"/>
                 <w:iCs w:val="false"/>
-                <w:color w:val="000000"/>
-                <w:sz w:val="22"/>
+                <w:color w:val="323539"/>
+                <w:sz w:val="16"/>
                 <w:szCs w:val="22"/>
               </w:rPr>
               <w:t xml:space="preserve">{{ИСХОДЯЩИЙ_НОМЕР}}</w:t>
@@ -1574,7 +1767,9 @@
                 <w:rFonts w:ascii="Times New Roman" w:cs="Times New Roman" w:eastAsia="Times New Roman" w:hAnsi="Times New Roman"/>
                 <w:b w:val="false"/>
                 <w:bCs w:val="false"/>
-                <w:sz w:val="22"/>
+                <w:i w:val="0"/>
+                <w:color w:val="323539"/>
+                <w:sz w:val="16"/>
                 <w:szCs w:val="22"/>
               </w:rPr>
               <w:t xml:space="preserve">, </w:t>
@@ -1584,10 +1779,10 @@
                 <w:rFonts w:ascii="Times New Roman" w:cs="Times New Roman" w:eastAsia="Times New Roman" w:hAnsi="Times New Roman"/>
                 <w:b/>
                 <w:bCs/>
-                <w:i w:val="false"/>
+                <w:i w:val="0"/>
                 <w:iCs w:val="false"/>
-                <w:color w:val="000000"/>
-                <w:sz w:val="22"/>
+                <w:color w:val="323539"/>
+                <w:sz w:val="16"/>
                 <w:szCs w:val="22"/>
               </w:rPr>
               <w:t xml:space="preserve">{{ДАТА_ДОКУМЕНТА}}</w:t>
@@ -1606,14 +1801,18 @@
           </w:tcPr>
           <w:p>
             <w:pPr>
-              <w:spacing w:after="0" w:line="240"/>
-            </w:pPr>
-            <w:r>
-              <w:rPr>
-                <w:rFonts w:ascii="Times New Roman" w:cs="Times New Roman" w:eastAsia="Times New Roman" w:hAnsi="Times New Roman"/>
-                <w:b w:val="false"/>
-                <w:bCs w:val="false"/>
-                <w:sz w:val="22"/>
+              <w:keepNext w:val="0"/>
+              <w:keepLines w:val="0"/>
+              <w:spacing w:after="20" w:line="240" w:before="0"/>
+            </w:pPr>
+            <w:r>
+              <w:rPr>
+                <w:rFonts w:ascii="Times New Roman" w:cs="Times New Roman" w:eastAsia="Times New Roman" w:hAnsi="Times New Roman"/>
+                <w:b w:val="false"/>
+                <w:bCs w:val="false"/>
+                <w:i w:val="0"/>
+                <w:color w:val="323539"/>
+                <w:sz w:val="16"/>
                 <w:szCs w:val="22"/>
               </w:rPr>
               <w:t xml:space="preserve">Реквизиты вашего письма</w:t>
@@ -1632,14 +1831,18 @@
           </w:tcPr>
           <w:p>
             <w:pPr>
-              <w:spacing w:after="0" w:line="240"/>
-            </w:pPr>
-            <w:r>
-              <w:rPr>
-                <w:rFonts w:ascii="Times New Roman" w:cs="Times New Roman" w:eastAsia="Times New Roman" w:hAnsi="Times New Roman"/>
-                <w:b w:val="false"/>
-                <w:bCs w:val="false"/>
-                <w:sz w:val="22"/>
+              <w:keepNext w:val="0"/>
+              <w:keepLines w:val="0"/>
+              <w:spacing w:after="20" w:line="240" w:before="0"/>
+            </w:pPr>
+            <w:r>
+              <w:rPr>
+                <w:rFonts w:ascii="Times New Roman" w:cs="Times New Roman" w:eastAsia="Times New Roman" w:hAnsi="Times New Roman"/>
+                <w:b w:val="false"/>
+                <w:bCs w:val="false"/>
+                <w:i w:val="0"/>
+                <w:color w:val="323539"/>
+                <w:sz w:val="16"/>
                 <w:szCs w:val="22"/>
               </w:rPr>
               <w:t xml:space="preserve">ваш журнал исходящих</w:t>
@@ -1660,17 +1863,19 @@
           </w:tcPr>
           <w:p>
             <w:pPr>
-              <w:spacing w:after="0" w:line="240"/>
-            </w:pPr>
-            <w:r>
-              <w:rPr>
-                <w:rFonts w:ascii="Times New Roman" w:cs="Times New Roman" w:eastAsia="Times New Roman" w:hAnsi="Times New Roman"/>
-                <w:b/>
-                <w:bCs/>
-                <w:i w:val="false"/>
+              <w:keepNext w:val="0"/>
+              <w:keepLines w:val="0"/>
+              <w:spacing w:after="20" w:line="240" w:before="0"/>
+            </w:pPr>
+            <w:r>
+              <w:rPr>
+                <w:rFonts w:ascii="Times New Roman" w:cs="Times New Roman" w:eastAsia="Times New Roman" w:hAnsi="Times New Roman"/>
+                <w:b/>
+                <w:bCs/>
+                <w:i w:val="0"/>
                 <w:iCs w:val="false"/>
-                <w:color w:val="000000"/>
-                <w:sz w:val="22"/>
+                <w:color w:val="323539"/>
+                <w:sz w:val="16"/>
                 <w:szCs w:val="22"/>
               </w:rPr>
               <w:t xml:space="preserve">{{НАИМЕНОВАНИЕ_ОБЪЕКТА_ПО_ПРОЕКТНОЙ_ДЕКЛАРАЦИИ}}</w:t>
@@ -1689,14 +1894,18 @@
           </w:tcPr>
           <w:p>
             <w:pPr>
-              <w:spacing w:after="0" w:line="240"/>
-            </w:pPr>
-            <w:r>
-              <w:rPr>
-                <w:rFonts w:ascii="Times New Roman" w:cs="Times New Roman" w:eastAsia="Times New Roman" w:hAnsi="Times New Roman"/>
-                <w:b w:val="false"/>
-                <w:bCs w:val="false"/>
-                <w:sz w:val="22"/>
+              <w:keepNext w:val="0"/>
+              <w:keepLines w:val="0"/>
+              <w:spacing w:after="20" w:line="240" w:before="0"/>
+            </w:pPr>
+            <w:r>
+              <w:rPr>
+                <w:rFonts w:ascii="Times New Roman" w:cs="Times New Roman" w:eastAsia="Times New Roman" w:hAnsi="Times New Roman"/>
+                <w:b w:val="false"/>
+                <w:bCs w:val="false"/>
+                <w:i w:val="0"/>
+                <w:color w:val="323539"/>
+                <w:sz w:val="16"/>
                 <w:szCs w:val="22"/>
               </w:rPr>
               <w:t xml:space="preserve">Наименование и адрес объекта долевого строительства дословно</w:t>
@@ -1715,14 +1924,18 @@
           </w:tcPr>
           <w:p>
             <w:pPr>
-              <w:spacing w:after="0" w:line="240"/>
-            </w:pPr>
-            <w:r>
-              <w:rPr>
-                <w:rFonts w:ascii="Times New Roman" w:cs="Times New Roman" w:eastAsia="Times New Roman" w:hAnsi="Times New Roman"/>
-                <w:b w:val="false"/>
-                <w:bCs w:val="false"/>
-                <w:sz w:val="22"/>
+              <w:keepNext w:val="0"/>
+              <w:keepLines w:val="0"/>
+              <w:spacing w:after="20" w:line="240" w:before="0"/>
+            </w:pPr>
+            <w:r>
+              <w:rPr>
+                <w:rFonts w:ascii="Times New Roman" w:cs="Times New Roman" w:eastAsia="Times New Roman" w:hAnsi="Times New Roman"/>
+                <w:b w:val="false"/>
+                <w:bCs w:val="false"/>
+                <w:i w:val="0"/>
+                <w:color w:val="323539"/>
+                <w:sz w:val="16"/>
                 <w:szCs w:val="22"/>
               </w:rPr>
               <w:t xml:space="preserve">проектная декларация в ЕИСЖС (наш.дом.рф)</w:t>
@@ -1743,17 +1956,19 @@
           </w:tcPr>
           <w:p>
             <w:pPr>
-              <w:spacing w:after="0" w:line="240"/>
-            </w:pPr>
-            <w:r>
-              <w:rPr>
-                <w:rFonts w:ascii="Times New Roman" w:cs="Times New Roman" w:eastAsia="Times New Roman" w:hAnsi="Times New Roman"/>
-                <w:b/>
-                <w:bCs/>
-                <w:i w:val="false"/>
+              <w:keepNext w:val="0"/>
+              <w:keepLines w:val="0"/>
+              <w:spacing w:after="20" w:line="240" w:before="0"/>
+            </w:pPr>
+            <w:r>
+              <w:rPr>
+                <w:rFonts w:ascii="Times New Roman" w:cs="Times New Roman" w:eastAsia="Times New Roman" w:hAnsi="Times New Roman"/>
+                <w:b/>
+                <w:bCs/>
+                <w:i w:val="0"/>
                 <w:iCs w:val="false"/>
-                <w:color w:val="000000"/>
-                <w:sz w:val="22"/>
+                <w:color w:val="323539"/>
+                <w:sz w:val="16"/>
                 <w:szCs w:val="22"/>
               </w:rPr>
               <w:t xml:space="preserve">{{ОСНОВАНИЕ_ЗАПРОСА: …}}</w:t>
@@ -1772,14 +1987,18 @@
           </w:tcPr>
           <w:p>
             <w:pPr>
-              <w:spacing w:after="0" w:line="240"/>
-            </w:pPr>
-            <w:r>
-              <w:rPr>
-                <w:rFonts w:ascii="Times New Roman" w:cs="Times New Roman" w:eastAsia="Times New Roman" w:hAnsi="Times New Roman"/>
-                <w:b w:val="false"/>
-                <w:bCs w:val="false"/>
-                <w:sz w:val="22"/>
+              <w:keepNext w:val="0"/>
+              <w:keepLines w:val="0"/>
+              <w:spacing w:after="20" w:line="240" w:before="0"/>
+            </w:pPr>
+            <w:r>
+              <w:rPr>
+                <w:rFonts w:ascii="Times New Roman" w:cs="Times New Roman" w:eastAsia="Times New Roman" w:hAnsi="Times New Roman"/>
+                <w:b w:val="false"/>
+                <w:bCs w:val="false"/>
+                <w:i w:val="0"/>
+                <w:color w:val="323539"/>
+                <w:sz w:val="16"/>
                 <w:szCs w:val="22"/>
               </w:rPr>
               <w:t xml:space="preserve">Выбрать один вариант из фигурных скобок: предложение о заключении договора либо исполнение действующего договора; невыбранный вариант удалить</w:t>
@@ -1798,14 +2017,18 @@
           </w:tcPr>
           <w:p>
             <w:pPr>
-              <w:spacing w:after="0" w:line="240"/>
-            </w:pPr>
-            <w:r>
-              <w:rPr>
-                <w:rFonts w:ascii="Times New Roman" w:cs="Times New Roman" w:eastAsia="Times New Roman" w:hAnsi="Times New Roman"/>
-                <w:b w:val="false"/>
-                <w:bCs w:val="false"/>
-                <w:sz w:val="22"/>
+              <w:keepNext w:val="0"/>
+              <w:keepLines w:val="0"/>
+              <w:spacing w:after="20" w:line="240" w:before="0"/>
+            </w:pPr>
+            <w:r>
+              <w:rPr>
+                <w:rFonts w:ascii="Times New Roman" w:cs="Times New Roman" w:eastAsia="Times New Roman" w:hAnsi="Times New Roman"/>
+                <w:b w:val="false"/>
+                <w:bCs w:val="false"/>
+                <w:i w:val="0"/>
+                <w:color w:val="323539"/>
+                <w:sz w:val="16"/>
                 <w:szCs w:val="22"/>
               </w:rPr>
               <w:t xml:space="preserve">ваша ситуация; реквизиты договора — из самого договора</w:t>
@@ -1826,17 +2049,19 @@
           </w:tcPr>
           <w:p>
             <w:pPr>
-              <w:spacing w:after="0" w:line="240"/>
-            </w:pPr>
-            <w:r>
-              <w:rPr>
-                <w:rFonts w:ascii="Times New Roman" w:cs="Times New Roman" w:eastAsia="Times New Roman" w:hAnsi="Times New Roman"/>
-                <w:b/>
-                <w:bCs/>
-                <w:i w:val="false"/>
+              <w:keepNext w:val="0"/>
+              <w:keepLines w:val="0"/>
+              <w:spacing w:after="20" w:line="240" w:before="0"/>
+            </w:pPr>
+            <w:r>
+              <w:rPr>
+                <w:rFonts w:ascii="Times New Roman" w:cs="Times New Roman" w:eastAsia="Times New Roman" w:hAnsi="Times New Roman"/>
+                <w:b/>
+                <w:bCs/>
+                <w:i w:val="0"/>
                 <w:iCs w:val="false"/>
-                <w:color w:val="000000"/>
-                <w:sz w:val="22"/>
+                <w:color w:val="323539"/>
+                <w:sz w:val="16"/>
                 <w:szCs w:val="22"/>
               </w:rPr>
               <w:t xml:space="preserve">{{ЧТО_ЗАВИСИТ_ОТ_ВВОДА: …}}</w:t>
@@ -1855,14 +2080,18 @@
           </w:tcPr>
           <w:p>
             <w:pPr>
-              <w:spacing w:after="0" w:line="240"/>
-            </w:pPr>
-            <w:r>
-              <w:rPr>
-                <w:rFonts w:ascii="Times New Roman" w:cs="Times New Roman" w:eastAsia="Times New Roman" w:hAnsi="Times New Roman"/>
-                <w:b w:val="false"/>
-                <w:bCs w:val="false"/>
-                <w:sz w:val="22"/>
+              <w:keepNext w:val="0"/>
+              <w:keepLines w:val="0"/>
+              <w:spacing w:after="20" w:line="240" w:before="0"/>
+            </w:pPr>
+            <w:r>
+              <w:rPr>
+                <w:rFonts w:ascii="Times New Roman" w:cs="Times New Roman" w:eastAsia="Times New Roman" w:hAnsi="Times New Roman"/>
+                <w:b w:val="false"/>
+                <w:bCs w:val="false"/>
+                <w:i w:val="0"/>
+                <w:color w:val="323539"/>
+                <w:sz w:val="16"/>
                 <w:szCs w:val="22"/>
               </w:rPr>
               <w:t xml:space="preserve">Выбрать один вариант: сроки расчётов по договору либо условия предлагаемого договора; невыбранный вариант удалить</w:t>
@@ -1881,14 +2110,18 @@
           </w:tcPr>
           <w:p>
             <w:pPr>
-              <w:spacing w:after="0" w:line="240"/>
-            </w:pPr>
-            <w:r>
-              <w:rPr>
-                <w:rFonts w:ascii="Times New Roman" w:cs="Times New Roman" w:eastAsia="Times New Roman" w:hAnsi="Times New Roman"/>
-                <w:b w:val="false"/>
-                <w:bCs w:val="false"/>
-                <w:sz w:val="22"/>
+              <w:keepNext w:val="0"/>
+              <w:keepLines w:val="0"/>
+              <w:spacing w:after="20" w:line="240" w:before="0"/>
+            </w:pPr>
+            <w:r>
+              <w:rPr>
+                <w:rFonts w:ascii="Times New Roman" w:cs="Times New Roman" w:eastAsia="Times New Roman" w:hAnsi="Times New Roman"/>
+                <w:b w:val="false"/>
+                <w:bCs w:val="false"/>
+                <w:i w:val="0"/>
+                <w:color w:val="323539"/>
+                <w:sz w:val="16"/>
                 <w:szCs w:val="22"/>
               </w:rPr>
               <w:t xml:space="preserve">ваша ситуация</w:t>
@@ -1909,17 +2142,19 @@
           </w:tcPr>
           <w:p>
             <w:pPr>
-              <w:spacing w:after="0" w:line="240"/>
-            </w:pPr>
-            <w:r>
-              <w:rPr>
-                <w:rFonts w:ascii="Times New Roman" w:cs="Times New Roman" w:eastAsia="Times New Roman" w:hAnsi="Times New Roman"/>
-                <w:b/>
-                <w:bCs/>
-                <w:i w:val="false"/>
+              <w:keepNext w:val="0"/>
+              <w:keepLines w:val="0"/>
+              <w:spacing w:after="20" w:line="240" w:before="0"/>
+            </w:pPr>
+            <w:r>
+              <w:rPr>
+                <w:rFonts w:ascii="Times New Roman" w:cs="Times New Roman" w:eastAsia="Times New Roman" w:hAnsi="Times New Roman"/>
+                <w:b/>
+                <w:bCs/>
+                <w:i w:val="0"/>
                 <w:iCs w:val="false"/>
-                <w:color w:val="000000"/>
-                <w:sz w:val="22"/>
+                <w:color w:val="323539"/>
+                <w:sz w:val="16"/>
                 <w:szCs w:val="22"/>
               </w:rPr>
               <w:t xml:space="preserve">{{СРОК_ОТВЕТА_НА_ЗАПРОС}}</w:t>
@@ -1938,14 +2173,18 @@
           </w:tcPr>
           <w:p>
             <w:pPr>
-              <w:spacing w:after="0" w:line="240"/>
-            </w:pPr>
-            <w:r>
-              <w:rPr>
-                <w:rFonts w:ascii="Times New Roman" w:cs="Times New Roman" w:eastAsia="Times New Roman" w:hAnsi="Times New Roman"/>
-                <w:b w:val="false"/>
-                <w:bCs w:val="false"/>
-                <w:sz w:val="22"/>
+              <w:keepNext w:val="0"/>
+              <w:keepLines w:val="0"/>
+              <w:spacing w:after="20" w:line="240" w:before="0"/>
+            </w:pPr>
+            <w:r>
+              <w:rPr>
+                <w:rFonts w:ascii="Times New Roman" w:cs="Times New Roman" w:eastAsia="Times New Roman" w:hAnsi="Times New Roman"/>
+                <w:b w:val="false"/>
+                <w:bCs w:val="false"/>
+                <w:i w:val="0"/>
+                <w:color w:val="323539"/>
+                <w:sz w:val="16"/>
                 <w:szCs w:val="22"/>
               </w:rPr>
               <w:t xml:space="preserve">Дата, до которой вы просите ответить. Назначаете сами, разумный рабочий срок; законом срок ответа на такой запрос не установлен</w:t>
@@ -1964,14 +2203,18 @@
           </w:tcPr>
           <w:p>
             <w:pPr>
-              <w:spacing w:after="0" w:line="240"/>
-            </w:pPr>
-            <w:r>
-              <w:rPr>
-                <w:rFonts w:ascii="Times New Roman" w:cs="Times New Roman" w:eastAsia="Times New Roman" w:hAnsi="Times New Roman"/>
-                <w:b w:val="false"/>
-                <w:bCs w:val="false"/>
-                <w:sz w:val="22"/>
+              <w:keepNext w:val="0"/>
+              <w:keepLines w:val="0"/>
+              <w:spacing w:after="20" w:line="240" w:before="0"/>
+            </w:pPr>
+            <w:r>
+              <w:rPr>
+                <w:rFonts w:ascii="Times New Roman" w:cs="Times New Roman" w:eastAsia="Times New Roman" w:hAnsi="Times New Roman"/>
+                <w:b w:val="false"/>
+                <w:bCs w:val="false"/>
+                <w:i w:val="0"/>
+                <w:color w:val="323539"/>
+                <w:sz w:val="16"/>
                 <w:szCs w:val="22"/>
               </w:rPr>
               <w:t xml:space="preserve">ваш календарь сделки</w:t>
@@ -1992,17 +2235,19 @@
           </w:tcPr>
           <w:p>
             <w:pPr>
-              <w:spacing w:after="0" w:line="240"/>
-            </w:pPr>
-            <w:r>
-              <w:rPr>
-                <w:rFonts w:ascii="Times New Roman" w:cs="Times New Roman" w:eastAsia="Times New Roman" w:hAnsi="Times New Roman"/>
-                <w:b/>
-                <w:bCs/>
-                <w:i w:val="false"/>
+              <w:keepNext w:val="0"/>
+              <w:keepLines w:val="0"/>
+              <w:spacing w:after="20" w:line="240" w:before="0"/>
+            </w:pPr>
+            <w:r>
+              <w:rPr>
+                <w:rFonts w:ascii="Times New Roman" w:cs="Times New Roman" w:eastAsia="Times New Roman" w:hAnsi="Times New Roman"/>
+                <w:b/>
+                <w:bCs/>
+                <w:i w:val="0"/>
                 <w:iCs w:val="false"/>
-                <w:color w:val="000000"/>
-                <w:sz w:val="22"/>
+                <w:color w:val="323539"/>
+                <w:sz w:val="16"/>
                 <w:szCs w:val="22"/>
               </w:rPr>
               <w:t xml:space="preserve">{{АДРЕС_ДЛЯ_ОТВЕТА}}</w:t>
@@ -2012,7 +2257,9 @@
                 <w:rFonts w:ascii="Times New Roman" w:cs="Times New Roman" w:eastAsia="Times New Roman" w:hAnsi="Times New Roman"/>
                 <w:b w:val="false"/>
                 <w:bCs w:val="false"/>
-                <w:sz w:val="22"/>
+                <w:i w:val="0"/>
+                <w:color w:val="323539"/>
+                <w:sz w:val="16"/>
                 <w:szCs w:val="22"/>
               </w:rPr>
               <w:t xml:space="preserve">, </w:t>
@@ -2022,10 +2269,10 @@
                 <w:rFonts w:ascii="Times New Roman" w:cs="Times New Roman" w:eastAsia="Times New Roman" w:hAnsi="Times New Roman"/>
                 <w:b/>
                 <w:bCs/>
-                <w:i w:val="false"/>
+                <w:i w:val="0"/>
                 <w:iCs w:val="false"/>
-                <w:color w:val="000000"/>
-                <w:sz w:val="22"/>
+                <w:color w:val="323539"/>
+                <w:sz w:val="16"/>
                 <w:szCs w:val="22"/>
               </w:rPr>
               <w:t xml:space="preserve">{{ЭЛЕКТРОННАЯ_ПОЧТА}}</w:t>
@@ -2044,14 +2291,18 @@
           </w:tcPr>
           <w:p>
             <w:pPr>
-              <w:spacing w:after="0" w:line="240"/>
-            </w:pPr>
-            <w:r>
-              <w:rPr>
-                <w:rFonts w:ascii="Times New Roman" w:cs="Times New Roman" w:eastAsia="Times New Roman" w:hAnsi="Times New Roman"/>
-                <w:b w:val="false"/>
-                <w:bCs w:val="false"/>
-                <w:sz w:val="22"/>
+              <w:keepNext w:val="0"/>
+              <w:keepLines w:val="0"/>
+              <w:spacing w:after="20" w:line="240" w:before="0"/>
+            </w:pPr>
+            <w:r>
+              <w:rPr>
+                <w:rFonts w:ascii="Times New Roman" w:cs="Times New Roman" w:eastAsia="Times New Roman" w:hAnsi="Times New Roman"/>
+                <w:b w:val="false"/>
+                <w:bCs w:val="false"/>
+                <w:i w:val="0"/>
+                <w:color w:val="323539"/>
+                <w:sz w:val="16"/>
                 <w:szCs w:val="22"/>
               </w:rPr>
               <w:t xml:space="preserve">Куда направить ответ: почтовый адрес и электронная почта, согласованная сторонами для обмена документами</w:t>
@@ -2070,14 +2321,18 @@
           </w:tcPr>
           <w:p>
             <w:pPr>
-              <w:spacing w:after="0" w:line="240"/>
-            </w:pPr>
-            <w:r>
-              <w:rPr>
-                <w:rFonts w:ascii="Times New Roman" w:cs="Times New Roman" w:eastAsia="Times New Roman" w:hAnsi="Times New Roman"/>
-                <w:b w:val="false"/>
-                <w:bCs w:val="false"/>
-                <w:sz w:val="22"/>
+              <w:keepNext w:val="0"/>
+              <w:keepLines w:val="0"/>
+              <w:spacing w:after="20" w:line="240" w:before="0"/>
+            </w:pPr>
+            <w:r>
+              <w:rPr>
+                <w:rFonts w:ascii="Times New Roman" w:cs="Times New Roman" w:eastAsia="Times New Roman" w:hAnsi="Times New Roman"/>
+                <w:b w:val="false"/>
+                <w:bCs w:val="false"/>
+                <w:i w:val="0"/>
+                <w:color w:val="323539"/>
+                <w:sz w:val="16"/>
                 <w:szCs w:val="22"/>
               </w:rPr>
               <w:t xml:space="preserve">ваши рабочие контакты, договор</w:t>
@@ -2098,17 +2353,19 @@
           </w:tcPr>
           <w:p>
             <w:pPr>
-              <w:spacing w:after="0" w:line="240"/>
-            </w:pPr>
-            <w:r>
-              <w:rPr>
-                <w:rFonts w:ascii="Times New Roman" w:cs="Times New Roman" w:eastAsia="Times New Roman" w:hAnsi="Times New Roman"/>
-                <w:b/>
-                <w:bCs/>
-                <w:i w:val="false"/>
+              <w:keepNext w:val="0"/>
+              <w:keepLines w:val="0"/>
+              <w:spacing w:after="20" w:line="240" w:before="0"/>
+            </w:pPr>
+            <w:r>
+              <w:rPr>
+                <w:rFonts w:ascii="Times New Roman" w:cs="Times New Roman" w:eastAsia="Times New Roman" w:hAnsi="Times New Roman"/>
+                <w:b/>
+                <w:bCs/>
+                <w:i w:val="0"/>
                 <w:iCs w:val="false"/>
-                <w:color w:val="000000"/>
-                <w:sz w:val="22"/>
+                <w:color w:val="323539"/>
+                <w:sz w:val="16"/>
                 <w:szCs w:val="22"/>
               </w:rPr>
               <w:t xml:space="preserve">{{НОМЕР_ДДУ}}</w:t>
@@ -2118,7 +2375,9 @@
                 <w:rFonts w:ascii="Times New Roman" w:cs="Times New Roman" w:eastAsia="Times New Roman" w:hAnsi="Times New Roman"/>
                 <w:b w:val="false"/>
                 <w:bCs w:val="false"/>
-                <w:sz w:val="22"/>
+                <w:i w:val="0"/>
+                <w:color w:val="323539"/>
+                <w:sz w:val="16"/>
                 <w:szCs w:val="22"/>
               </w:rPr>
               <w:t xml:space="preserve">, </w:t>
@@ -2128,10 +2387,10 @@
                 <w:rFonts w:ascii="Times New Roman" w:cs="Times New Roman" w:eastAsia="Times New Roman" w:hAnsi="Times New Roman"/>
                 <w:b/>
                 <w:bCs/>
-                <w:i w:val="false"/>
+                <w:i w:val="0"/>
                 <w:iCs w:val="false"/>
-                <w:color w:val="000000"/>
-                <w:sz w:val="22"/>
+                <w:color w:val="323539"/>
+                <w:sz w:val="16"/>
                 <w:szCs w:val="22"/>
               </w:rPr>
               <w:t xml:space="preserve">{{ДАТА_ДДУ}}</w:t>
@@ -2150,14 +2409,18 @@
           </w:tcPr>
           <w:p>
             <w:pPr>
-              <w:spacing w:after="0" w:line="240"/>
-            </w:pPr>
-            <w:r>
-              <w:rPr>
-                <w:rFonts w:ascii="Times New Roman" w:cs="Times New Roman" w:eastAsia="Times New Roman" w:hAnsi="Times New Roman"/>
-                <w:b w:val="false"/>
-                <w:bCs w:val="false"/>
-                <w:sz w:val="22"/>
+              <w:keepNext w:val="0"/>
+              <w:keepLines w:val="0"/>
+              <w:spacing w:after="20" w:line="240" w:before="0"/>
+            </w:pPr>
+            <w:r>
+              <w:rPr>
+                <w:rFonts w:ascii="Times New Roman" w:cs="Times New Roman" w:eastAsia="Times New Roman" w:hAnsi="Times New Roman"/>
+                <w:b w:val="false"/>
+                <w:bCs w:val="false"/>
+                <w:i w:val="0"/>
+                <w:color w:val="323539"/>
+                <w:sz w:val="16"/>
                 <w:szCs w:val="22"/>
               </w:rPr>
               <w:t xml:space="preserve">Реквизиты договора участия в долевом строительстве, права по которому вам предлагают</w:t>
@@ -2176,14 +2439,18 @@
           </w:tcPr>
           <w:p>
             <w:pPr>
-              <w:spacing w:after="0" w:line="240"/>
-            </w:pPr>
-            <w:r>
-              <w:rPr>
-                <w:rFonts w:ascii="Times New Roman" w:cs="Times New Roman" w:eastAsia="Times New Roman" w:hAnsi="Times New Roman"/>
-                <w:b w:val="false"/>
-                <w:bCs w:val="false"/>
-                <w:sz w:val="22"/>
+              <w:keepNext w:val="0"/>
+              <w:keepLines w:val="0"/>
+              <w:spacing w:after="20" w:line="240" w:before="0"/>
+            </w:pPr>
+            <w:r>
+              <w:rPr>
+                <w:rFonts w:ascii="Times New Roman" w:cs="Times New Roman" w:eastAsia="Times New Roman" w:hAnsi="Times New Roman"/>
+                <w:b w:val="false"/>
+                <w:bCs w:val="false"/>
+                <w:i w:val="0"/>
+                <w:color w:val="323539"/>
+                <w:sz w:val="16"/>
                 <w:szCs w:val="22"/>
               </w:rPr>
               <w:t xml:space="preserve">сам ДДУ; регистрация проверяется по выписке ЕГРН на земельный участок</w:t>
@@ -2204,17 +2471,19 @@
           </w:tcPr>
           <w:p>
             <w:pPr>
-              <w:spacing w:after="0" w:line="240"/>
-            </w:pPr>
-            <w:r>
-              <w:rPr>
-                <w:rFonts w:ascii="Times New Roman" w:cs="Times New Roman" w:eastAsia="Times New Roman" w:hAnsi="Times New Roman"/>
-                <w:b/>
-                <w:bCs/>
-                <w:i w:val="false"/>
+              <w:keepNext w:val="0"/>
+              <w:keepLines w:val="0"/>
+              <w:spacing w:after="20" w:line="240" w:before="0"/>
+            </w:pPr>
+            <w:r>
+              <w:rPr>
+                <w:rFonts w:ascii="Times New Roman" w:cs="Times New Roman" w:eastAsia="Times New Roman" w:hAnsi="Times New Roman"/>
+                <w:b/>
+                <w:bCs/>
+                <w:i w:val="0"/>
                 <w:iCs w:val="false"/>
-                <w:color w:val="000000"/>
-                <w:sz w:val="22"/>
+                <w:color w:val="323539"/>
+                <w:sz w:val="16"/>
                 <w:szCs w:val="22"/>
               </w:rPr>
               <w:t xml:space="preserve">{{ОПИСАНИЕ_ОБЪЕКТА_ДОЛЕВОГО_СТРОИТЕЛЬСТВА}}</w:t>
@@ -2233,17 +2502,21 @@
           </w:tcPr>
           <w:p>
             <w:pPr>
-              <w:spacing w:after="0" w:line="240"/>
-            </w:pPr>
-            <w:r>
-              <w:rPr>
-                <w:rFonts w:ascii="Times New Roman" w:cs="Times New Roman" w:eastAsia="Times New Roman" w:hAnsi="Times New Roman"/>
-                <w:b w:val="false"/>
-                <w:bCs w:val="false"/>
-                <w:sz w:val="22"/>
-                <w:szCs w:val="22"/>
-              </w:rPr>
-              <w:t xml:space="preserve">Квартира или иной объект по ДДУ: строительный номер, площадь, этаж — как в договоре</w:t>
+              <w:keepNext w:val="0"/>
+              <w:keepLines w:val="0"/>
+              <w:spacing w:after="20" w:line="240" w:before="0"/>
+            </w:pPr>
+            <w:r>
+              <w:rPr>
+                <w:rFonts w:ascii="Times New Roman" w:cs="Times New Roman" w:eastAsia="Times New Roman" w:hAnsi="Times New Roman"/>
+                <w:b w:val="false"/>
+                <w:bCs w:val="false"/>
+                <w:i w:val="0"/>
+                <w:color w:val="323539"/>
+                <w:sz w:val="16"/>
+                <w:szCs w:val="22"/>
+              </w:rPr>
+              <w:t>Жилое или офисное помещение, машино-место либо иной объект по ДДУ: номер, площадь и другие реквизиты по договору</w:t>
             </w:r>
           </w:p>
         </w:tc>
@@ -2259,14 +2532,18 @@
           </w:tcPr>
           <w:p>
             <w:pPr>
-              <w:spacing w:after="0" w:line="240"/>
-            </w:pPr>
-            <w:r>
-              <w:rPr>
-                <w:rFonts w:ascii="Times New Roman" w:cs="Times New Roman" w:eastAsia="Times New Roman" w:hAnsi="Times New Roman"/>
-                <w:b w:val="false"/>
-                <w:bCs w:val="false"/>
-                <w:sz w:val="22"/>
+              <w:keepNext w:val="0"/>
+              <w:keepLines w:val="0"/>
+              <w:spacing w:after="20" w:line="240" w:before="0"/>
+            </w:pPr>
+            <w:r>
+              <w:rPr>
+                <w:rFonts w:ascii="Times New Roman" w:cs="Times New Roman" w:eastAsia="Times New Roman" w:hAnsi="Times New Roman"/>
+                <w:b w:val="false"/>
+                <w:bCs w:val="false"/>
+                <w:i w:val="0"/>
+                <w:color w:val="323539"/>
+                <w:sz w:val="16"/>
                 <w:szCs w:val="22"/>
               </w:rPr>
               <w:t xml:space="preserve">предмет ДДУ, приложения к нему</w:t>
@@ -2287,17 +2564,19 @@
           </w:tcPr>
           <w:p>
             <w:pPr>
-              <w:spacing w:after="0" w:line="240"/>
-            </w:pPr>
-            <w:r>
-              <w:rPr>
-                <w:rFonts w:ascii="Times New Roman" w:cs="Times New Roman" w:eastAsia="Times New Roman" w:hAnsi="Times New Roman"/>
-                <w:b/>
-                <w:bCs/>
-                <w:i w:val="false"/>
+              <w:keepNext w:val="0"/>
+              <w:keepLines w:val="0"/>
+              <w:spacing w:after="20" w:line="240" w:before="0"/>
+            </w:pPr>
+            <w:r>
+              <w:rPr>
+                <w:rFonts w:ascii="Times New Roman" w:cs="Times New Roman" w:eastAsia="Times New Roman" w:hAnsi="Times New Roman"/>
+                <w:b/>
+                <w:bCs/>
+                <w:i w:val="0"/>
                 <w:iCs w:val="false"/>
-                <w:color w:val="000000"/>
-                <w:sz w:val="22"/>
+                <w:color w:val="323539"/>
+                <w:sz w:val="16"/>
                 <w:szCs w:val="22"/>
               </w:rPr>
               <w:t xml:space="preserve">{{НАИМЕНОВАНИЕ_БАНКА}}</w:t>
@@ -2307,7 +2586,9 @@
                 <w:rFonts w:ascii="Times New Roman" w:cs="Times New Roman" w:eastAsia="Times New Roman" w:hAnsi="Times New Roman"/>
                 <w:b w:val="false"/>
                 <w:bCs w:val="false"/>
-                <w:sz w:val="22"/>
+                <w:i w:val="0"/>
+                <w:color w:val="323539"/>
+                <w:sz w:val="16"/>
                 <w:szCs w:val="22"/>
               </w:rPr>
               <w:t xml:space="preserve">, </w:t>
@@ -2317,10 +2598,10 @@
                 <w:rFonts w:ascii="Times New Roman" w:cs="Times New Roman" w:eastAsia="Times New Roman" w:hAnsi="Times New Roman"/>
                 <w:b/>
                 <w:bCs/>
-                <w:i w:val="false"/>
+                <w:i w:val="0"/>
                 <w:iCs w:val="false"/>
-                <w:color w:val="000000"/>
-                <w:sz w:val="22"/>
+                <w:color w:val="323539"/>
+                <w:sz w:val="16"/>
                 <w:szCs w:val="22"/>
               </w:rPr>
               <w:t xml:space="preserve">{{НАИМЕНОВАНИЕ_БАНКА_ЕСЛИ_ИЗВЕСТЕН}}</w:t>
@@ -2339,14 +2620,18 @@
           </w:tcPr>
           <w:p>
             <w:pPr>
-              <w:spacing w:after="0" w:line="240"/>
-            </w:pPr>
-            <w:r>
-              <w:rPr>
-                <w:rFonts w:ascii="Times New Roman" w:cs="Times New Roman" w:eastAsia="Times New Roman" w:hAnsi="Times New Roman"/>
-                <w:b w:val="false"/>
-                <w:bCs w:val="false"/>
-                <w:sz w:val="22"/>
+              <w:keepNext w:val="0"/>
+              <w:keepLines w:val="0"/>
+              <w:spacing w:after="20" w:line="240" w:before="0"/>
+            </w:pPr>
+            <w:r>
+              <w:rPr>
+                <w:rFonts w:ascii="Times New Roman" w:cs="Times New Roman" w:eastAsia="Times New Roman" w:hAnsi="Times New Roman"/>
+                <w:b w:val="false"/>
+                <w:bCs w:val="false"/>
+                <w:i w:val="0"/>
+                <w:color w:val="323539"/>
+                <w:sz w:val="16"/>
                 <w:szCs w:val="22"/>
               </w:rPr>
               <w:t xml:space="preserve">Банк, в котором открыт счёт эскроу по передаваемому ДДУ. Неизвестен — поле в запросе оставить пустым и спросить в пункте 1 запроса</w:t>
@@ -2365,14 +2650,18 @@
           </w:tcPr>
           <w:p>
             <w:pPr>
-              <w:spacing w:after="0" w:line="240"/>
-            </w:pPr>
-            <w:r>
-              <w:rPr>
-                <w:rFonts w:ascii="Times New Roman" w:cs="Times New Roman" w:eastAsia="Times New Roman" w:hAnsi="Times New Roman"/>
-                <w:b w:val="false"/>
-                <w:bCs w:val="false"/>
-                <w:sz w:val="22"/>
+              <w:keepNext w:val="0"/>
+              <w:keepLines w:val="0"/>
+              <w:spacing w:after="20" w:line="240" w:before="0"/>
+            </w:pPr>
+            <w:r>
+              <w:rPr>
+                <w:rFonts w:ascii="Times New Roman" w:cs="Times New Roman" w:eastAsia="Times New Roman" w:hAnsi="Times New Roman"/>
+                <w:b w:val="false"/>
+                <w:bCs w:val="false"/>
+                <w:i w:val="0"/>
+                <w:color w:val="323539"/>
+                <w:sz w:val="16"/>
                 <w:szCs w:val="22"/>
               </w:rPr>
               <w:t xml:space="preserve">ДДУ (раздел о порядке оплаты), проектная декларация</w:t>
@@ -2393,17 +2682,19 @@
           </w:tcPr>
           <w:p>
             <w:pPr>
-              <w:spacing w:after="0" w:line="240"/>
-            </w:pPr>
-            <w:r>
-              <w:rPr>
-                <w:rFonts w:ascii="Times New Roman" w:cs="Times New Roman" w:eastAsia="Times New Roman" w:hAnsi="Times New Roman"/>
-                <w:b/>
-                <w:bCs/>
-                <w:i w:val="false"/>
+              <w:keepNext w:val="0"/>
+              <w:keepLines w:val="0"/>
+              <w:spacing w:after="20" w:line="240" w:before="0"/>
+            </w:pPr>
+            <w:r>
+              <w:rPr>
+                <w:rFonts w:ascii="Times New Roman" w:cs="Times New Roman" w:eastAsia="Times New Roman" w:hAnsi="Times New Roman"/>
+                <w:b/>
+                <w:bCs/>
+                <w:i w:val="0"/>
                 <w:iCs w:val="false"/>
-                <w:color w:val="000000"/>
-                <w:sz w:val="22"/>
+                <w:color w:val="323539"/>
+                <w:sz w:val="16"/>
                 <w:szCs w:val="22"/>
               </w:rPr>
               <w:t xml:space="preserve">{{ДАТА_СПРАВКИ}}</w:t>
@@ -2422,14 +2713,18 @@
           </w:tcPr>
           <w:p>
             <w:pPr>
-              <w:spacing w:after="0" w:line="240"/>
-            </w:pPr>
-            <w:r>
-              <w:rPr>
-                <w:rFonts w:ascii="Times New Roman" w:cs="Times New Roman" w:eastAsia="Times New Roman" w:hAnsi="Times New Roman"/>
-                <w:b w:val="false"/>
-                <w:bCs w:val="false"/>
-                <w:sz w:val="22"/>
+              <w:keepNext w:val="0"/>
+              <w:keepLines w:val="0"/>
+              <w:spacing w:after="20" w:line="240" w:before="0"/>
+            </w:pPr>
+            <w:r>
+              <w:rPr>
+                <w:rFonts w:ascii="Times New Roman" w:cs="Times New Roman" w:eastAsia="Times New Roman" w:hAnsi="Times New Roman"/>
+                <w:b w:val="false"/>
+                <w:bCs w:val="false"/>
+                <w:i w:val="0"/>
+                <w:color w:val="323539"/>
+                <w:sz w:val="16"/>
                 <w:szCs w:val="22"/>
               </w:rPr>
               <w:t xml:space="preserve">Дата справки банка об оплате цены ДДУ — в формулировке пункта уступки о переданном оплаченном праве</w:t>
@@ -2448,14 +2743,18 @@
           </w:tcPr>
           <w:p>
             <w:pPr>
-              <w:spacing w:after="0" w:line="240"/>
-            </w:pPr>
-            <w:r>
-              <w:rPr>
-                <w:rFonts w:ascii="Times New Roman" w:cs="Times New Roman" w:eastAsia="Times New Roman" w:hAnsi="Times New Roman"/>
-                <w:b w:val="false"/>
-                <w:bCs w:val="false"/>
-                <w:sz w:val="22"/>
+              <w:keepNext w:val="0"/>
+              <w:keepLines w:val="0"/>
+              <w:spacing w:after="20" w:line="240" w:before="0"/>
+            </w:pPr>
+            <w:r>
+              <w:rPr>
+                <w:rFonts w:ascii="Times New Roman" w:cs="Times New Roman" w:eastAsia="Times New Roman" w:hAnsi="Times New Roman"/>
+                <w:b w:val="false"/>
+                <w:bCs w:val="false"/>
+                <w:i w:val="0"/>
+                <w:color w:val="323539"/>
+                <w:sz w:val="16"/>
                 <w:szCs w:val="22"/>
               </w:rPr>
               <w:t xml:space="preserve">сама справка (выписка) банка</w:t>
@@ -2476,17 +2775,19 @@
           </w:tcPr>
           <w:p>
             <w:pPr>
-              <w:spacing w:after="0" w:line="240"/>
-            </w:pPr>
-            <w:r>
-              <w:rPr>
-                <w:rFonts w:ascii="Times New Roman" w:cs="Times New Roman" w:eastAsia="Times New Roman" w:hAnsi="Times New Roman"/>
-                <w:b/>
-                <w:bCs/>
-                <w:i w:val="false"/>
+              <w:keepNext w:val="0"/>
+              <w:keepLines w:val="0"/>
+              <w:spacing w:after="20" w:line="240" w:before="0"/>
+            </w:pPr>
+            <w:r>
+              <w:rPr>
+                <w:rFonts w:ascii="Times New Roman" w:cs="Times New Roman" w:eastAsia="Times New Roman" w:hAnsi="Times New Roman"/>
+                <w:b/>
+                <w:bCs/>
+                <w:i w:val="0"/>
                 <w:iCs w:val="false"/>
-                <w:color w:val="000000"/>
-                <w:sz w:val="22"/>
+                <w:color w:val="323539"/>
+                <w:sz w:val="16"/>
                 <w:szCs w:val="22"/>
               </w:rPr>
               <w:t xml:space="preserve">{{ЦЕНА_РЫНКА}}</w:t>
@@ -2505,17 +2806,21 @@
           </w:tcPr>
           <w:p>
             <w:pPr>
-              <w:spacing w:after="0" w:line="240"/>
-            </w:pPr>
-            <w:r>
-              <w:rPr>
-                <w:rFonts w:ascii="Times New Roman" w:cs="Times New Roman" w:eastAsia="Times New Roman" w:hAnsi="Times New Roman"/>
-                <w:b w:val="false"/>
-                <w:bCs w:val="false"/>
-                <w:sz w:val="22"/>
-                <w:szCs w:val="22"/>
-              </w:rPr>
-              <w:t xml:space="preserve">Реальная цена продажи такой квартиры сегодня</w:t>
+              <w:keepNext w:val="0"/>
+              <w:keepLines w:val="0"/>
+              <w:spacing w:after="20" w:line="240" w:before="0"/>
+            </w:pPr>
+            <w:r>
+              <w:rPr>
+                <w:rFonts w:ascii="Times New Roman" w:cs="Times New Roman" w:eastAsia="Times New Roman" w:hAnsi="Times New Roman"/>
+                <w:b w:val="false"/>
+                <w:bCs w:val="false"/>
+                <w:i w:val="0"/>
+                <w:color w:val="323539"/>
+                <w:sz w:val="16"/>
+                <w:szCs w:val="22"/>
+              </w:rPr>
+              <w:t>Ожидаемая цена реализации соответствующего помещения или машино-места</w:t>
             </w:r>
           </w:p>
         </w:tc>
@@ -2531,17 +2836,21 @@
           </w:tcPr>
           <w:p>
             <w:pPr>
-              <w:spacing w:after="0" w:line="240"/>
-            </w:pPr>
-            <w:r>
-              <w:rPr>
-                <w:rFonts w:ascii="Times New Roman" w:cs="Times New Roman" w:eastAsia="Times New Roman" w:hAnsi="Times New Roman"/>
-                <w:b w:val="false"/>
-                <w:bCs w:val="false"/>
-                <w:sz w:val="22"/>
-                <w:szCs w:val="22"/>
-              </w:rPr>
-              <w:t xml:space="preserve">стакан предложений по дому и району, а не прайс застройщика</w:t>
+              <w:keepNext w:val="0"/>
+              <w:keepLines w:val="0"/>
+              <w:spacing w:after="20" w:line="240" w:before="0"/>
+            </w:pPr>
+            <w:r>
+              <w:rPr>
+                <w:rFonts w:ascii="Times New Roman" w:cs="Times New Roman" w:eastAsia="Times New Roman" w:hAnsi="Times New Roman"/>
+                <w:b w:val="false"/>
+                <w:bCs w:val="false"/>
+                <w:i w:val="0"/>
+                <w:color w:val="323539"/>
+                <w:sz w:val="16"/>
+                <w:szCs w:val="22"/>
+              </w:rPr>
+              <w:t>рыночные предложения по сопоставимым объектам, а не только прайс застройщика</w:t>
             </w:r>
           </w:p>
         </w:tc>
@@ -2559,17 +2868,19 @@
           </w:tcPr>
           <w:p>
             <w:pPr>
-              <w:spacing w:after="0" w:line="240"/>
-            </w:pPr>
-            <w:r>
-              <w:rPr>
-                <w:rFonts w:ascii="Times New Roman" w:cs="Times New Roman" w:eastAsia="Times New Roman" w:hAnsi="Times New Roman"/>
-                <w:b/>
-                <w:bCs/>
-                <w:i w:val="false"/>
+              <w:keepNext w:val="0"/>
+              <w:keepLines w:val="0"/>
+              <w:spacing w:after="20" w:line="240" w:before="0"/>
+            </w:pPr>
+            <w:r>
+              <w:rPr>
+                <w:rFonts w:ascii="Times New Roman" w:cs="Times New Roman" w:eastAsia="Times New Roman" w:hAnsi="Times New Roman"/>
+                <w:b/>
+                <w:bCs/>
+                <w:i w:val="0"/>
                 <w:iCs w:val="false"/>
-                <w:color w:val="000000"/>
-                <w:sz w:val="22"/>
+                <w:color w:val="323539"/>
+                <w:sz w:val="16"/>
                 <w:szCs w:val="22"/>
               </w:rPr>
               <w:t xml:space="preserve">{{ЦЕНА_В_РАСЧЁТЕ}}</w:t>
@@ -2588,17 +2899,21 @@
           </w:tcPr>
           <w:p>
             <w:pPr>
-              <w:spacing w:after="0" w:line="240"/>
-            </w:pPr>
-            <w:r>
-              <w:rPr>
-                <w:rFonts w:ascii="Times New Roman" w:cs="Times New Roman" w:eastAsia="Times New Roman" w:hAnsi="Times New Roman"/>
-                <w:b w:val="false"/>
-                <w:bCs w:val="false"/>
-                <w:sz w:val="22"/>
-                <w:szCs w:val="22"/>
-              </w:rPr>
-              <w:t xml:space="preserve">Цена метра, по которой квартиру засчитывают в счёт работ, с учётом скидки</w:t>
+              <w:keepNext w:val="0"/>
+              <w:keepLines w:val="0"/>
+              <w:spacing w:after="20" w:line="240" w:before="0"/>
+            </w:pPr>
+            <w:r>
+              <w:rPr>
+                <w:rFonts w:ascii="Times New Roman" w:cs="Times New Roman" w:eastAsia="Times New Roman" w:hAnsi="Times New Roman"/>
+                <w:b w:val="false"/>
+                <w:bCs w:val="false"/>
+                <w:i w:val="0"/>
+                <w:color w:val="323539"/>
+                <w:sz w:val="16"/>
+                <w:szCs w:val="22"/>
+              </w:rPr>
+              <w:t>Стоимость объекта или квадратного метра, принимаемая в счёт оплаты выполненных работ</w:t>
             </w:r>
           </w:p>
         </w:tc>
@@ -2614,14 +2929,18 @@
           </w:tcPr>
           <w:p>
             <w:pPr>
-              <w:spacing w:after="0" w:line="240"/>
-            </w:pPr>
-            <w:r>
-              <w:rPr>
-                <w:rFonts w:ascii="Times New Roman" w:cs="Times New Roman" w:eastAsia="Times New Roman" w:hAnsi="Times New Roman"/>
-                <w:b w:val="false"/>
-                <w:bCs w:val="false"/>
-                <w:sz w:val="22"/>
+              <w:keepNext w:val="0"/>
+              <w:keepLines w:val="0"/>
+              <w:spacing w:after="20" w:line="240" w:before="0"/>
+            </w:pPr>
+            <w:r>
+              <w:rPr>
+                <w:rFonts w:ascii="Times New Roman" w:cs="Times New Roman" w:eastAsia="Times New Roman" w:hAnsi="Times New Roman"/>
+                <w:b w:val="false"/>
+                <w:bCs w:val="false"/>
+                <w:i w:val="0"/>
+                <w:color w:val="323539"/>
+                <w:sz w:val="16"/>
                 <w:szCs w:val="22"/>
               </w:rPr>
               <w:t xml:space="preserve">предложение застройщика, проект договора</w:t>
@@ -2642,17 +2961,19 @@
           </w:tcPr>
           <w:p>
             <w:pPr>
-              <w:spacing w:after="0" w:line="240"/>
-            </w:pPr>
-            <w:r>
-              <w:rPr>
-                <w:rFonts w:ascii="Times New Roman" w:cs="Times New Roman" w:eastAsia="Times New Roman" w:hAnsi="Times New Roman"/>
-                <w:b/>
-                <w:bCs/>
-                <w:i w:val="false"/>
+              <w:keepNext w:val="0"/>
+              <w:keepLines w:val="0"/>
+              <w:spacing w:after="20" w:line="240" w:before="0"/>
+            </w:pPr>
+            <w:r>
+              <w:rPr>
+                <w:rFonts w:ascii="Times New Roman" w:cs="Times New Roman" w:eastAsia="Times New Roman" w:hAnsi="Times New Roman"/>
+                <w:b/>
+                <w:bCs/>
+                <w:i w:val="0"/>
                 <w:iCs w:val="false"/>
-                <w:color w:val="000000"/>
-                <w:sz w:val="22"/>
+                <w:color w:val="323539"/>
+                <w:sz w:val="16"/>
                 <w:szCs w:val="22"/>
               </w:rPr>
               <w:t xml:space="preserve">{{ДОЛЯ_ДЕНЬГАМИ}}</w:t>
@@ -2671,14 +2992,18 @@
           </w:tcPr>
           <w:p>
             <w:pPr>
-              <w:spacing w:after="0" w:line="240"/>
-            </w:pPr>
-            <w:r>
-              <w:rPr>
-                <w:rFonts w:ascii="Times New Roman" w:cs="Times New Roman" w:eastAsia="Times New Roman" w:hAnsi="Times New Roman"/>
-                <w:b w:val="false"/>
-                <w:bCs w:val="false"/>
-                <w:sz w:val="22"/>
+              <w:keepNext w:val="0"/>
+              <w:keepLines w:val="0"/>
+              <w:spacing w:after="20" w:line="240" w:before="0"/>
+            </w:pPr>
+            <w:r>
+              <w:rPr>
+                <w:rFonts w:ascii="Times New Roman" w:cs="Times New Roman" w:eastAsia="Times New Roman" w:hAnsi="Times New Roman"/>
+                <w:b w:val="false"/>
+                <w:bCs w:val="false"/>
+                <w:i w:val="0"/>
+                <w:color w:val="323539"/>
+                <w:sz w:val="16"/>
                 <w:szCs w:val="22"/>
               </w:rPr>
               <w:t xml:space="preserve">Согласованная денежная часть расчёта: метрами — не более остальной доли</w:t>
@@ -2697,14 +3022,18 @@
           </w:tcPr>
           <w:p>
             <w:pPr>
-              <w:spacing w:after="0" w:line="240"/>
-            </w:pPr>
-            <w:r>
-              <w:rPr>
-                <w:rFonts w:ascii="Times New Roman" w:cs="Times New Roman" w:eastAsia="Times New Roman" w:hAnsi="Times New Roman"/>
-                <w:b w:val="false"/>
-                <w:bCs w:val="false"/>
-                <w:sz w:val="22"/>
+              <w:keepNext w:val="0"/>
+              <w:keepLines w:val="0"/>
+              <w:spacing w:after="20" w:line="240" w:before="0"/>
+            </w:pPr>
+            <w:r>
+              <w:rPr>
+                <w:rFonts w:ascii="Times New Roman" w:cs="Times New Roman" w:eastAsia="Times New Roman" w:hAnsi="Times New Roman"/>
+                <w:b w:val="false"/>
+                <w:bCs w:val="false"/>
+                <w:i w:val="0"/>
+                <w:color w:val="323539"/>
+                <w:sz w:val="16"/>
                 <w:szCs w:val="22"/>
               </w:rPr>
               <w:t xml:space="preserve">ваши переговоры; итог записывается в договор подряда</w:t>
@@ -2715,20 +3044,22 @@
     </w:tbl>
     <w:p>
       <w:pPr>
-        <w:spacing w:after="120" w:line="276"/>
+        <w:spacing w:after="60" w:line="259" w:before="0" w:lineRule="auto"/>
       </w:pPr>
     </w:p>
     <w:p>
       <w:pPr>
         <w:pStyle w:val="Heading2"/>
         <w:keepNext/>
-        <w:spacing w:after="120" w:before="260"/>
+        <w:spacing w:after="60" w:before="0"/>
       </w:pPr>
       <w:r>
         <w:rPr>
           <w:rFonts w:ascii="Times New Roman" w:cs="Times New Roman" w:eastAsia="Times New Roman" w:hAnsi="Times New Roman"/>
           <w:b/>
           <w:bCs/>
+          <w:i w:val="0"/>
+          <w:color w:val="323539"/>
           <w:sz w:val="26"/>
           <w:szCs w:val="26"/>
         </w:rPr>
@@ -2737,20 +3068,24 @@
     </w:p>
     <w:p>
       <w:pPr>
-        <w:spacing w:after="120" w:line="276"/>
+        <w:spacing w:after="60" w:line="259" w:before="0" w:lineRule="auto"/>
       </w:pPr>
       <w:r>
         <w:rPr>
           <w:rFonts w:ascii="Times New Roman" w:cs="Times New Roman" w:eastAsia="Times New Roman" w:hAnsi="Times New Roman"/>
-          <w:sz w:val="24"/>
+          <w:i w:val="0"/>
+          <w:color w:val="323539"/>
+          <w:sz w:val="21"/>
           <w:szCs w:val="24"/>
         </w:rPr>
         <w:t xml:space="preserve">В полях этого комплекта нет ни одной ставки, ни одного срока и ни одного размера платежа, установленного законом: такие значения берутся из действующей редакции нормы на дату проверки, а не из скачанного файла.</w:t>
       </w:r>
     </w:p>
     <w:sectPr>
+      <w:headerReference w:type="default" r:id="rId8"/>
+      <w:footerReference w:type="default" r:id="rId9"/>
       <w:pgSz w:w="11906" w:h="16838" w:orient="portrait"/>
-      <w:pgMar w:top="1133" w:right="850" w:bottom="1133" w:left="1417" w:header="708" w:footer="708" w:gutter="0"/>
+      <w:pgMar w:top="500" w:right="850" w:bottom="500" w:left="1417" w:header="708" w:footer="708" w:gutter="0"/>
       <w:pgNumType/>
       <w:docGrid w:linePitch="360"/>
     </w:sectPr>
@@ -2799,6 +3134,16 @@
 </w:endnotes>
 </file>
 
+<file path=word/footer1.xml><?xml version="1.0" encoding="utf-8"?>
+<w:ftr xmlns:m="http://schemas.openxmlformats.org/officeDocument/2006/math" xmlns:mc="http://schemas.openxmlformats.org/markup-compatibility/2006" xmlns:mo="http://schemas.microsoft.com/office/mac/office/2008/main" xmlns:mv="urn:schemas-microsoft-com:mac:vml" xmlns:o="urn:schemas-microsoft-com:office:office" xmlns:r="http://schemas.openxmlformats.org/officeDocument/2006/relationships" xmlns:v="urn:schemas-microsoft-com:vml" xmlns:w10="urn:schemas-microsoft-com:office:word" xmlns:w14="http://schemas.microsoft.com/office/word/2010/wordml" xmlns:w="http://schemas.openxmlformats.org/wordprocessingml/2006/main" xmlns:wne="http://schemas.microsoft.com/office/word/2006/wordml" xmlns:wp14="http://schemas.microsoft.com/office/word/2010/wordprocessingDrawing" xmlns:wp="http://schemas.openxmlformats.org/drawingml/2006/wordprocessingDrawing" xmlns:wpc="http://schemas.microsoft.com/office/word/2010/wordprocessingCanvas" xmlns:wpg="http://schemas.microsoft.com/office/word/2010/wordprocessingGroup" xmlns:wpi="http://schemas.microsoft.com/office/word/2010/wordprocessingInk" xmlns:wps="http://schemas.microsoft.com/office/word/2010/wordprocessingShape" mc:Ignorable="w14 wp14">
+  <w:p>
+    <w:pPr>
+      <w:pStyle w:val="Footer"/>
+    </w:pPr>
+  </w:p>
+</w:ftr>
+</file>
+
 <file path=word/footnotes.xml><?xml version="1.0" encoding="utf-8"?>
 <w:footnotes xmlns:wpc="http://schemas.microsoft.com/office/word/2010/wordprocessingCanvas" xmlns:mc="http://schemas.openxmlformats.org/markup-compatibility/2006" xmlns:o="urn:schemas-microsoft-com:office:office" xmlns:r="http://schemas.openxmlformats.org/officeDocument/2006/relationships" xmlns:m="http://schemas.openxmlformats.org/officeDocument/2006/math" xmlns:v="urn:schemas-microsoft-com:vml" xmlns:wp14="http://schemas.microsoft.com/office/word/2010/wordprocessingDrawing" xmlns:wp="http://schemas.openxmlformats.org/drawingml/2006/wordprocessingDrawing" xmlns:w10="urn:schemas-microsoft-com:office:word" xmlns:w="http://schemas.openxmlformats.org/wordprocessingml/2006/main" xmlns:w14="http://schemas.microsoft.com/office/word/2010/wordml" xmlns:w15="http://schemas.microsoft.com/office/word/2012/wordml" xmlns:wpg="http://schemas.microsoft.com/office/word/2010/wordprocessingGroup" xmlns:wpi="http://schemas.microsoft.com/office/word/2010/wordprocessingInk" xmlns:wne="http://schemas.microsoft.com/office/word/2006/wordml" xmlns:wps="http://schemas.microsoft.com/office/word/2010/wordprocessingShape" mc:Ignorable="w14 w15 wp14">
   <w:footnote w:type="separator" w:id="-1">
@@ -2834,6 +3179,16 @@
     </w:p>
   </w:footnote>
 </w:footnotes>
+</file>
+
+<file path=word/header1.xml><?xml version="1.0" encoding="utf-8"?>
+<w:hdr xmlns:m="http://schemas.openxmlformats.org/officeDocument/2006/math" xmlns:mc="http://schemas.openxmlformats.org/markup-compatibility/2006" xmlns:mo="http://schemas.microsoft.com/office/mac/office/2008/main" xmlns:mv="urn:schemas-microsoft-com:mac:vml" xmlns:o="urn:schemas-microsoft-com:office:office" xmlns:r="http://schemas.openxmlformats.org/officeDocument/2006/relationships" xmlns:v="urn:schemas-microsoft-com:vml" xmlns:w10="urn:schemas-microsoft-com:office:word" xmlns:w14="http://schemas.microsoft.com/office/word/2010/wordml" xmlns:w="http://schemas.openxmlformats.org/wordprocessingml/2006/main" xmlns:wne="http://schemas.microsoft.com/office/word/2006/wordml" xmlns:wp14="http://schemas.microsoft.com/office/word/2010/wordprocessingDrawing" xmlns:wp="http://schemas.openxmlformats.org/drawingml/2006/wordprocessingDrawing" xmlns:wpc="http://schemas.microsoft.com/office/word/2010/wordprocessingCanvas" xmlns:wpg="http://schemas.microsoft.com/office/word/2010/wordprocessingGroup" xmlns:wpi="http://schemas.microsoft.com/office/word/2010/wordprocessingInk" xmlns:wps="http://schemas.microsoft.com/office/word/2010/wordprocessingShape" mc:Ignorable="w14 wp14">
+  <w:p>
+    <w:pPr>
+      <w:pStyle w:val="Header"/>
+    </w:pPr>
+  </w:p>
+</w:hdr>
 </file>
 
 <file path=word/numbering.xml><?xml version="1.0" encoding="utf-8"?>
@@ -2967,6 +3322,8 @@
     <w:next w:val="Normal"/>
     <w:qFormat/>
     <w:rPr>
+      <w:i w:val="0"/>
+      <w:color w:val="323539"/>
       <w:sz w:val="56"/>
       <w:szCs w:val="56"/>
     </w:rPr>
@@ -2977,7 +3334,8 @@
     <w:next w:val="Normal"/>
     <w:qFormat/>
     <w:rPr>
-      <w:color w:val="2E74B5"/>
+      <w:i w:val="0"/>
+      <w:color w:val="323539"/>
       <w:sz w:val="32"/>
       <w:szCs w:val="32"/>
     </w:rPr>
@@ -2988,7 +3346,8 @@
     <w:next w:val="Normal"/>
     <w:qFormat/>
     <w:rPr>
-      <w:color w:val="2E74B5"/>
+      <w:i w:val="0"/>
+      <w:color w:val="323539"/>
       <w:sz w:val="26"/>
       <w:szCs w:val="26"/>
     </w:rPr>
@@ -2999,7 +3358,8 @@
     <w:next w:val="Normal"/>
     <w:qFormat/>
     <w:rPr>
-      <w:color w:val="1F4D78"/>
+      <w:i w:val="0"/>
+      <w:color w:val="323539"/>
       <w:sz w:val="24"/>
       <w:szCs w:val="24"/>
     </w:rPr>
@@ -3010,9 +3370,9 @@
     <w:next w:val="Normal"/>
     <w:qFormat/>
     <w:rPr>
-      <w:i/>
+      <w:i w:val="0"/>
       <w:iCs/>
-      <w:color w:val="2E74B5"/>
+      <w:color w:val="323539"/>
     </w:rPr>
   </w:style>
   <w:style w:type="paragraph" w:styleId="Heading5">
@@ -3021,7 +3381,8 @@
     <w:next w:val="Normal"/>
     <w:qFormat/>
     <w:rPr>
-      <w:color w:val="2E74B5"/>
+      <w:i w:val="0"/>
+      <w:color w:val="323539"/>
     </w:rPr>
   </w:style>
   <w:style w:type="paragraph" w:styleId="Heading6">
@@ -3030,7 +3391,8 @@
     <w:next w:val="Normal"/>
     <w:qFormat/>
     <w:rPr>
-      <w:color w:val="1F4D78"/>
+      <w:i w:val="0"/>
+      <w:color w:val="323539"/>
     </w:rPr>
   </w:style>
   <w:style w:type="paragraph" w:styleId="Strong">
@@ -3041,12 +3403,18 @@
     <w:rPr>
       <w:b/>
       <w:bCs/>
+      <w:i w:val="0"/>
+      <w:color w:val="323539"/>
     </w:rPr>
   </w:style>
   <w:style w:type="paragraph" w:styleId="ListParagraph">
     <w:name w:val="List Paragraph"/>
     <w:basedOn w:val="Normal"/>
     <w:qFormat/>
+    <w:rPr>
+      <w:i w:val="0"/>
+      <w:color w:val="323539"/>
+    </w:rPr>
   </w:style>
   <w:style w:type="character" w:styleId="Hyperlink">
     <w:name w:val="Hyperlink"/>
@@ -3079,6 +3447,8 @@
       <w:spacing w:after="0" w:line="240" w:lineRule="auto"/>
     </w:pPr>
     <w:rPr>
+      <w:i w:val="0"/>
+      <w:color w:val="323539"/>
       <w:sz w:val="20"/>
       <w:szCs w:val="20"/>
     </w:rPr>
@@ -3116,6 +3486,8 @@
       <w:spacing w:after="0" w:line="240" w:lineRule="auto"/>
     </w:pPr>
     <w:rPr>
+      <w:i w:val="0"/>
+      <w:color w:val="323539"/>
       <w:sz w:val="20"/>
       <w:szCs w:val="20"/>
     </w:rPr>

</xml_diff>